<commit_message>
docs: update project proposal
</commit_message>
<xml_diff>
--- a/Project Proposal.docx
+++ b/Project Proposal.docx
@@ -185,6 +185,15 @@
           </w:r>
         </w:p>
         <w:p>
+          <w:pPr>
+            <w:pStyle w:val="TOC1"/>
+            <w:tabs>
+              <w:tab w:val="right" w:leader="dot" w:pos="9350"/>
+            </w:tabs>
+            <w:rPr>
+              <w:noProof/>
+            </w:rPr>
+          </w:pPr>
           <w:r>
             <w:fldChar w:fldCharType="begin"/>
           </w:r>
@@ -194,14 +203,473 @@
           <w:r>
             <w:fldChar w:fldCharType="separate"/>
           </w:r>
-          <w:r>
+          <w:hyperlink w:anchor="_Toc241497195" w:history="1">
+            <w:r>
+              <w:rPr>
+                <w:rStyle w:val="Hyperlink"/>
+                <w:noProof/>
+              </w:rPr>
+              <w:t>1.0 Introduction</w:t>
+            </w:r>
+            <w:r>
+              <w:rPr>
+                <w:noProof/>
+                <w:webHidden/>
+              </w:rPr>
+              <w:tab/>
+            </w:r>
+            <w:r>
+              <w:rPr>
+                <w:noProof/>
+                <w:webHidden/>
+              </w:rPr>
+              <w:fldChar w:fldCharType="begin"/>
+            </w:r>
+            <w:r>
+              <w:rPr>
+                <w:noProof/>
+                <w:webHidden/>
+              </w:rPr>
+              <w:instrText xml:space="preserve"> PAGEREF _Toc241497195 \h </w:instrText>
+            </w:r>
+            <w:r>
+              <w:rPr>
+                <w:noProof/>
+                <w:webHidden/>
+              </w:rPr>
+            </w:r>
+            <w:r>
+              <w:rPr>
+                <w:noProof/>
+                <w:webHidden/>
+              </w:rPr>
+              <w:fldChar w:fldCharType="separate"/>
+            </w:r>
+            <w:r>
+              <w:rPr>
+                <w:noProof/>
+                <w:webHidden/>
+              </w:rPr>
+              <w:t>3</w:t>
+            </w:r>
+            <w:r>
+              <w:rPr>
+                <w:noProof/>
+                <w:webHidden/>
+              </w:rPr>
+              <w:fldChar w:fldCharType="end"/>
+            </w:r>
+          </w:hyperlink>
+        </w:p>
+        <w:p>
+          <w:pPr>
+            <w:pStyle w:val="TOC1"/>
+            <w:tabs>
+              <w:tab w:val="right" w:leader="dot" w:pos="9350"/>
+            </w:tabs>
             <w:rPr>
-              <w:b/>
-              <w:bCs/>
               <w:noProof/>
             </w:rPr>
-            <w:t>No table of contents entries found.</w:t>
-          </w:r>
+          </w:pPr>
+          <w:hyperlink w:anchor="_Toc241497196" w:history="1">
+            <w:r>
+              <w:rPr>
+                <w:rStyle w:val="Hyperlink"/>
+                <w:noProof/>
+              </w:rPr>
+              <w:t>2.0 Problem Statement</w:t>
+            </w:r>
+            <w:r>
+              <w:rPr>
+                <w:noProof/>
+                <w:webHidden/>
+              </w:rPr>
+              <w:tab/>
+            </w:r>
+            <w:r>
+              <w:rPr>
+                <w:noProof/>
+                <w:webHidden/>
+              </w:rPr>
+              <w:fldChar w:fldCharType="begin"/>
+            </w:r>
+            <w:r>
+              <w:rPr>
+                <w:noProof/>
+                <w:webHidden/>
+              </w:rPr>
+              <w:instrText xml:space="preserve"> PAGEREF _Toc241497196 \h </w:instrText>
+            </w:r>
+            <w:r>
+              <w:rPr>
+                <w:noProof/>
+                <w:webHidden/>
+              </w:rPr>
+            </w:r>
+            <w:r>
+              <w:rPr>
+                <w:noProof/>
+                <w:webHidden/>
+              </w:rPr>
+              <w:fldChar w:fldCharType="separate"/>
+            </w:r>
+            <w:r>
+              <w:rPr>
+                <w:noProof/>
+                <w:webHidden/>
+              </w:rPr>
+              <w:t>4</w:t>
+            </w:r>
+            <w:r>
+              <w:rPr>
+                <w:noProof/>
+                <w:webHidden/>
+              </w:rPr>
+              <w:fldChar w:fldCharType="end"/>
+            </w:r>
+          </w:hyperlink>
+        </w:p>
+        <w:p>
+          <w:pPr>
+            <w:pStyle w:val="TOC1"/>
+            <w:tabs>
+              <w:tab w:val="right" w:leader="dot" w:pos="9350"/>
+            </w:tabs>
+            <w:rPr>
+              <w:noProof/>
+            </w:rPr>
+          </w:pPr>
+          <w:hyperlink w:anchor="_Toc241497197" w:history="1">
+            <w:r>
+              <w:rPr>
+                <w:rStyle w:val="Hyperlink"/>
+                <w:noProof/>
+              </w:rPr>
+              <w:t>3.0 Object-oriented Programming Solutions</w:t>
+            </w:r>
+            <w:r>
+              <w:rPr>
+                <w:noProof/>
+                <w:webHidden/>
+              </w:rPr>
+              <w:tab/>
+            </w:r>
+            <w:r>
+              <w:rPr>
+                <w:noProof/>
+                <w:webHidden/>
+              </w:rPr>
+              <w:fldChar w:fldCharType="begin"/>
+            </w:r>
+            <w:r>
+              <w:rPr>
+                <w:noProof/>
+                <w:webHidden/>
+              </w:rPr>
+              <w:instrText xml:space="preserve"> PAGEREF _Toc241497197 \h </w:instrText>
+            </w:r>
+            <w:r>
+              <w:rPr>
+                <w:noProof/>
+                <w:webHidden/>
+              </w:rPr>
+            </w:r>
+            <w:r>
+              <w:rPr>
+                <w:noProof/>
+                <w:webHidden/>
+              </w:rPr>
+              <w:fldChar w:fldCharType="separate"/>
+            </w:r>
+            <w:r>
+              <w:rPr>
+                <w:noProof/>
+                <w:webHidden/>
+              </w:rPr>
+              <w:t>5</w:t>
+            </w:r>
+            <w:r>
+              <w:rPr>
+                <w:noProof/>
+                <w:webHidden/>
+              </w:rPr>
+              <w:fldChar w:fldCharType="end"/>
+            </w:r>
+          </w:hyperlink>
+        </w:p>
+        <w:p>
+          <w:pPr>
+            <w:pStyle w:val="TOC1"/>
+            <w:tabs>
+              <w:tab w:val="right" w:leader="dot" w:pos="9350"/>
+            </w:tabs>
+            <w:rPr>
+              <w:noProof/>
+            </w:rPr>
+          </w:pPr>
+          <w:hyperlink w:anchor="_Toc241497198" w:history="1">
+            <w:r>
+              <w:rPr>
+                <w:rStyle w:val="Hyperlink"/>
+                <w:noProof/>
+              </w:rPr>
+              <w:t>4.0 Proposed System Features</w:t>
+            </w:r>
+            <w:r>
+              <w:rPr>
+                <w:noProof/>
+                <w:webHidden/>
+              </w:rPr>
+              <w:tab/>
+            </w:r>
+            <w:r>
+              <w:rPr>
+                <w:noProof/>
+                <w:webHidden/>
+              </w:rPr>
+              <w:fldChar w:fldCharType="begin"/>
+            </w:r>
+            <w:r>
+              <w:rPr>
+                <w:noProof/>
+                <w:webHidden/>
+              </w:rPr>
+              <w:instrText xml:space="preserve"> PAGEREF _Toc241497198 \h </w:instrText>
+            </w:r>
+            <w:r>
+              <w:rPr>
+                <w:noProof/>
+                <w:webHidden/>
+              </w:rPr>
+            </w:r>
+            <w:r>
+              <w:rPr>
+                <w:noProof/>
+                <w:webHidden/>
+              </w:rPr>
+              <w:fldChar w:fldCharType="separate"/>
+            </w:r>
+            <w:r>
+              <w:rPr>
+                <w:noProof/>
+                <w:webHidden/>
+              </w:rPr>
+              <w:t>6</w:t>
+            </w:r>
+            <w:r>
+              <w:rPr>
+                <w:noProof/>
+                <w:webHidden/>
+              </w:rPr>
+              <w:fldChar w:fldCharType="end"/>
+            </w:r>
+          </w:hyperlink>
+        </w:p>
+        <w:p>
+          <w:pPr>
+            <w:pStyle w:val="TOC1"/>
+            <w:tabs>
+              <w:tab w:val="right" w:leader="dot" w:pos="9350"/>
+            </w:tabs>
+            <w:rPr>
+              <w:noProof/>
+            </w:rPr>
+          </w:pPr>
+          <w:hyperlink w:anchor="_Toc241497199" w:history="1">
+            <w:r>
+              <w:rPr>
+                <w:rStyle w:val="Hyperlink"/>
+                <w:noProof/>
+              </w:rPr>
+              <w:t>5.0 Expected Outcome</w:t>
+            </w:r>
+            <w:r>
+              <w:rPr>
+                <w:noProof/>
+                <w:webHidden/>
+              </w:rPr>
+              <w:tab/>
+            </w:r>
+            <w:r>
+              <w:rPr>
+                <w:noProof/>
+                <w:webHidden/>
+              </w:rPr>
+              <w:fldChar w:fldCharType="begin"/>
+            </w:r>
+            <w:r>
+              <w:rPr>
+                <w:noProof/>
+                <w:webHidden/>
+              </w:rPr>
+              <w:instrText xml:space="preserve"> PAGEREF _Toc241497199 \h </w:instrText>
+            </w:r>
+            <w:r>
+              <w:rPr>
+                <w:noProof/>
+                <w:webHidden/>
+              </w:rPr>
+            </w:r>
+            <w:r>
+              <w:rPr>
+                <w:noProof/>
+                <w:webHidden/>
+              </w:rPr>
+              <w:fldChar w:fldCharType="separate"/>
+            </w:r>
+            <w:r>
+              <w:rPr>
+                <w:noProof/>
+                <w:webHidden/>
+              </w:rPr>
+              <w:t>8</w:t>
+            </w:r>
+            <w:r>
+              <w:rPr>
+                <w:noProof/>
+                <w:webHidden/>
+              </w:rPr>
+              <w:fldChar w:fldCharType="end"/>
+            </w:r>
+          </w:hyperlink>
+        </w:p>
+        <w:p>
+          <w:pPr>
+            <w:pStyle w:val="TOC1"/>
+            <w:tabs>
+              <w:tab w:val="right" w:leader="dot" w:pos="9350"/>
+            </w:tabs>
+            <w:rPr>
+              <w:noProof/>
+            </w:rPr>
+          </w:pPr>
+          <w:hyperlink w:anchor="_Toc241497200" w:history="1">
+            <w:r>
+              <w:rPr>
+                <w:rStyle w:val="Hyperlink"/>
+                <w:noProof/>
+              </w:rPr>
+              <w:t>6.0 Conclusion</w:t>
+            </w:r>
+            <w:r>
+              <w:rPr>
+                <w:noProof/>
+                <w:webHidden/>
+              </w:rPr>
+              <w:tab/>
+            </w:r>
+            <w:r>
+              <w:rPr>
+                <w:noProof/>
+                <w:webHidden/>
+              </w:rPr>
+              <w:fldChar w:fldCharType="begin"/>
+            </w:r>
+            <w:r>
+              <w:rPr>
+                <w:noProof/>
+                <w:webHidden/>
+              </w:rPr>
+              <w:instrText xml:space="preserve"> PAGEREF _Toc241497200 \h </w:instrText>
+            </w:r>
+            <w:r>
+              <w:rPr>
+                <w:noProof/>
+                <w:webHidden/>
+              </w:rPr>
+            </w:r>
+            <w:r>
+              <w:rPr>
+                <w:noProof/>
+                <w:webHidden/>
+              </w:rPr>
+              <w:fldChar w:fldCharType="separate"/>
+            </w:r>
+            <w:r>
+              <w:rPr>
+                <w:noProof/>
+                <w:webHidden/>
+              </w:rPr>
+              <w:t>9</w:t>
+            </w:r>
+            <w:r>
+              <w:rPr>
+                <w:noProof/>
+                <w:webHidden/>
+              </w:rPr>
+              <w:fldChar w:fldCharType="end"/>
+            </w:r>
+          </w:hyperlink>
+        </w:p>
+        <w:p>
+          <w:pPr>
+            <w:pStyle w:val="TOC1"/>
+            <w:tabs>
+              <w:tab w:val="right" w:leader="dot" w:pos="9350"/>
+            </w:tabs>
+            <w:rPr>
+              <w:noProof/>
+            </w:rPr>
+          </w:pPr>
+          <w:hyperlink w:anchor="_Toc241497201" w:history="1">
+            <w:r>
+              <w:rPr>
+                <w:rStyle w:val="Hyperlink"/>
+                <w:noProof/>
+              </w:rPr>
+              <w:t>7.0 References</w:t>
+            </w:r>
+            <w:r>
+              <w:rPr>
+                <w:noProof/>
+                <w:webHidden/>
+              </w:rPr>
+              <w:tab/>
+            </w:r>
+            <w:r>
+              <w:rPr>
+                <w:noProof/>
+                <w:webHidden/>
+              </w:rPr>
+              <w:fldChar w:fldCharType="begin"/>
+            </w:r>
+            <w:r>
+              <w:rPr>
+                <w:noProof/>
+                <w:webHidden/>
+              </w:rPr>
+              <w:instrText xml:space="preserve"> PAGEREF _Toc241497201 \h </w:instrText>
+            </w:r>
+            <w:r>
+              <w:rPr>
+                <w:noProof/>
+                <w:webHidden/>
+              </w:rPr>
+            </w:r>
+            <w:r>
+              <w:rPr>
+                <w:noProof/>
+                <w:webHidden/>
+              </w:rPr>
+              <w:fldChar w:fldCharType="separate"/>
+            </w:r>
+            <w:r>
+              <w:rPr>
+                <w:noProof/>
+                <w:webHidden/>
+              </w:rPr>
+              <w:t>10</w:t>
+            </w:r>
+            <w:r>
+              <w:rPr>
+                <w:noProof/>
+                <w:webHidden/>
+              </w:rPr>
+              <w:fldChar w:fldCharType="end"/>
+            </w:r>
+          </w:hyperlink>
+        </w:p>
+        <w:p>
           <w:r>
             <w:rPr>
               <w:b/>
@@ -226,6 +694,7 @@
           <w:szCs w:val="32"/>
         </w:rPr>
       </w:pPr>
+      <w:bookmarkStart w:id="0" w:name="_Toc241497195"/>
       <w:r>
         <w:rPr>
           <w:sz w:val="32"/>
@@ -241,6 +710,7 @@
         </w:rPr>
         <w:t>Introduction</w:t>
       </w:r>
+      <w:bookmarkEnd w:id="0"/>
     </w:p>
     <w:p>
       <w:r>
@@ -261,6 +731,7 @@
           <w:szCs w:val="32"/>
         </w:rPr>
       </w:pPr>
+      <w:bookmarkStart w:id="1" w:name="_Toc241497196"/>
       <w:r>
         <w:rPr>
           <w:sz w:val="32"/>
@@ -276,6 +747,7 @@
         </w:rPr>
         <w:t>Problem Statement</w:t>
       </w:r>
+      <w:bookmarkEnd w:id="1"/>
     </w:p>
     <w:p>
       <w:r>
@@ -345,6 +817,7 @@
           <w:szCs w:val="32"/>
         </w:rPr>
       </w:pPr>
+      <w:bookmarkStart w:id="2" w:name="_Toc241497197"/>
       <w:r>
         <w:rPr>
           <w:sz w:val="32"/>
@@ -353,6 +826,7 @@
         <w:lastRenderedPageBreak/>
         <w:t>3.0 Object-oriented Programming Solutions</w:t>
       </w:r>
+      <w:bookmarkEnd w:id="2"/>
     </w:p>
     <w:p>
       <w:r>
@@ -364,23 +838,7 @@
     </w:p>
     <w:p>
       <w:r>
-        <w:t xml:space="preserve">Creating a base class Vehicle and derived class such as </w:t>
-      </w:r>
-      <w:proofErr w:type="spellStart"/>
-      <w:r>
-        <w:t>StandardCar</w:t>
-      </w:r>
-      <w:proofErr w:type="spellEnd"/>
-      <w:r>
-        <w:t xml:space="preserve">, </w:t>
-      </w:r>
-      <w:proofErr w:type="spellStart"/>
-      <w:r>
-        <w:t>LuxuryCar</w:t>
-      </w:r>
-      <w:proofErr w:type="spellEnd"/>
-      <w:r>
-        <w:t>, and SUV. Then, implementing a</w:t>
+        <w:t>Creating a base class Vehicle and derived class such as StandardCar, LuxuryCar, and SUV. Then, implementing a</w:t>
       </w:r>
       <w:r>
         <w:t>n</w:t>
@@ -396,23 +854,7 @@
         <w:t>abstract function</w:t>
       </w:r>
       <w:r>
-        <w:t xml:space="preserve"> </w:t>
-      </w:r>
-      <w:proofErr w:type="spellStart"/>
-      <w:r>
-        <w:t>calculateDamageFee</w:t>
-      </w:r>
-      <w:proofErr w:type="spellEnd"/>
-      <w:r>
-        <w:t xml:space="preserve"> (double </w:t>
-      </w:r>
-      <w:proofErr w:type="spellStart"/>
-      <w:r>
-        <w:t>severityScore</w:t>
-      </w:r>
-      <w:proofErr w:type="spellEnd"/>
-      <w:r>
-        <w:t xml:space="preserve">) using </w:t>
+        <w:t xml:space="preserve"> calculateDamageFee (double severityScore) using </w:t>
       </w:r>
       <w:r>
         <w:rPr>
@@ -422,39 +864,7 @@
         <w:t>polymorphism</w:t>
       </w:r>
       <w:r>
-        <w:t xml:space="preserve">. For instance, repairing a scratched </w:t>
-      </w:r>
-      <w:proofErr w:type="spellStart"/>
-      <w:r>
-        <w:t>LuxuryCar</w:t>
-      </w:r>
-      <w:proofErr w:type="spellEnd"/>
-      <w:r>
-        <w:t xml:space="preserve"> computes a higher rate or multiplier than a </w:t>
-      </w:r>
-      <w:proofErr w:type="spellStart"/>
-      <w:r>
-        <w:t>StandardCar</w:t>
-      </w:r>
-      <w:proofErr w:type="spellEnd"/>
-      <w:r>
-        <w:t xml:space="preserve">. Storing inspection logs inside a </w:t>
-      </w:r>
-      <w:proofErr w:type="gramStart"/>
-      <w:r>
-        <w:t>std::</w:t>
-      </w:r>
-      <w:proofErr w:type="gramEnd"/>
-      <w:r>
-        <w:t xml:space="preserve">vector&lt;string&gt; or a custom </w:t>
-      </w:r>
-      <w:proofErr w:type="spellStart"/>
-      <w:r>
-        <w:t>DamageLog</w:t>
-      </w:r>
-      <w:proofErr w:type="spellEnd"/>
-      <w:r>
-        <w:t xml:space="preserve"> object ensures its transparent record-keeping.</w:t>
+        <w:t>. For instance, repairing a scratched LuxuryCar computes a higher rate or multiplier than a StandardCar. Storing inspection logs inside a std::vector&lt;string&gt; or a custom DamageLog object ensures its transparent record-keeping.</w:t>
       </w:r>
       <w:r>
         <w:t xml:space="preserve"> Besides, system can automatically </w:t>
@@ -482,288 +892,153 @@
     </w:p>
     <w:p>
       <w:r>
-        <w:t xml:space="preserve">Implement a centralized </w:t>
-      </w:r>
-      <w:proofErr w:type="spellStart"/>
-      <w:r>
-        <w:t>RentalSystem</w:t>
-      </w:r>
-      <w:proofErr w:type="spellEnd"/>
-      <w:r>
-        <w:t xml:space="preserve"> class that manages fleet availability in real time. Use STL containers like </w:t>
-      </w:r>
-      <w:proofErr w:type="gramStart"/>
+        <w:t xml:space="preserve">Implement a centralized RentalSystem class that manages fleet availability in real time. Use STL containers like </w:t>
+      </w:r>
       <w:r>
         <w:rPr>
           <w:b/>
           <w:bCs/>
         </w:rPr>
-        <w:t>std::</w:t>
-      </w:r>
-      <w:proofErr w:type="spellStart"/>
-      <w:proofErr w:type="gramEnd"/>
+        <w:t>std::unordered_map</w:t>
+      </w:r>
+      <w:r>
+        <w:t>&lt;string, Vehicle*&gt; for O(1) fast lookup by License Plate or Vehicle ID or std::vector combined with std::find_if algorithm.</w:t>
+      </w:r>
+      <w:r>
+        <w:t xml:space="preserve"> Automated availability state changes (Available </w:t>
+      </w:r>
+      <w:r>
+        <w:rPr>
+          <w:rFonts w:hint="eastAsia"/>
+        </w:rPr>
+        <w:sym w:font="Wingdings" w:char="F0DF"/>
+      </w:r>
+      <w:r>
+        <w:rPr>
+          <w:rFonts w:hint="eastAsia"/>
+        </w:rPr>
+        <w:sym w:font="Wingdings" w:char="F0E0"/>
+      </w:r>
+      <w:r>
+        <w:t>Rented) execute instantly, preventing double-bookings and speeding up transactions.</w:t>
+      </w:r>
+      <w:r>
+        <w:t xml:space="preserve"> System also offer</w:t>
+      </w:r>
+      <w:r>
+        <w:t>s</w:t>
+      </w:r>
+      <w:r>
+        <w:t xml:space="preserve"> </w:t>
+      </w:r>
+      <w:r>
+        <w:t>date/duration validation utilities and automatic booking schedules stored in system memory</w:t>
+      </w:r>
+      <w:r>
+        <w:t>.</w:t>
+      </w:r>
+      <w:r>
+        <w:t xml:space="preserve"> </w:t>
+      </w:r>
+      <w:r>
+        <w:t>A</w:t>
+      </w:r>
+      <w:r>
+        <w:t>utomated transaction processing and digital receipt generation within the terminal</w:t>
+      </w:r>
+      <w:r>
+        <w:t xml:space="preserve"> </w:t>
+      </w:r>
+      <w:r>
+        <w:t xml:space="preserve">is necessary to avoid </w:t>
+      </w:r>
+      <w:r>
+        <w:t xml:space="preserve">long </w:t>
+      </w:r>
+      <w:r>
+        <w:t>waiting time and improve efficiency of rental process.</w:t>
+      </w:r>
+    </w:p>
+    <w:p>
+      <w:r>
+        <w:t xml:space="preserve">3.3 </w:t>
+      </w:r>
+      <w:r>
+        <w:t xml:space="preserve">Solution for </w:t>
+      </w:r>
+      <w:r>
+        <w:t>Stagnant Pricing Models Affecting Profits</w:t>
+      </w:r>
+    </w:p>
+    <w:p>
+      <w:r>
+        <w:t xml:space="preserve">Define an </w:t>
+      </w:r>
       <w:r>
         <w:rPr>
           <w:b/>
           <w:bCs/>
         </w:rPr>
-        <w:t>unordered_map</w:t>
-      </w:r>
-      <w:proofErr w:type="spellEnd"/>
-      <w:r>
-        <w:t xml:space="preserve">&lt;string, Vehicle*&gt; for </w:t>
-      </w:r>
-      <w:proofErr w:type="gramStart"/>
-      <w:r>
-        <w:t>O(</w:t>
-      </w:r>
-      <w:proofErr w:type="gramEnd"/>
-      <w:r>
-        <w:t xml:space="preserve">1) fast lookup by License Plate or Vehicle ID or </w:t>
-      </w:r>
-      <w:proofErr w:type="gramStart"/>
-      <w:r>
-        <w:t>std::</w:t>
-      </w:r>
-      <w:proofErr w:type="gramEnd"/>
-      <w:r>
-        <w:t xml:space="preserve">vector combined with </w:t>
-      </w:r>
-      <w:proofErr w:type="gramStart"/>
-      <w:r>
-        <w:t>std::</w:t>
-      </w:r>
-      <w:proofErr w:type="spellStart"/>
-      <w:proofErr w:type="gramEnd"/>
-      <w:r>
-        <w:t>find_if</w:t>
-      </w:r>
-      <w:proofErr w:type="spellEnd"/>
-      <w:r>
-        <w:t xml:space="preserve"> algorithm.</w:t>
-      </w:r>
-      <w:r>
-        <w:t xml:space="preserve"> Automated availability state changes (Available </w:t>
-      </w:r>
-      <w:r>
-        <w:rPr>
-          <w:rFonts w:hint="eastAsia"/>
-        </w:rPr>
-        <w:sym w:font="Wingdings" w:char="F0DF"/>
-      </w:r>
-      <w:r>
-        <w:rPr>
-          <w:rFonts w:hint="eastAsia"/>
-        </w:rPr>
-        <w:sym w:font="Wingdings" w:char="F0E0"/>
-      </w:r>
-      <w:r>
-        <w:t>Rented) execute instantly, preventing double-bookings and speeding up transactions.</w:t>
-      </w:r>
-      <w:r>
-        <w:t xml:space="preserve"> System also offer</w:t>
-      </w:r>
-      <w:r>
-        <w:t>s</w:t>
-      </w:r>
-      <w:r>
-        <w:t xml:space="preserve"> </w:t>
-      </w:r>
-      <w:r>
-        <w:t>date/duration validation utilities and automatic booking schedules stored in system memory</w:t>
-      </w:r>
-      <w:r>
-        <w:t>.</w:t>
-      </w:r>
-      <w:r>
-        <w:t xml:space="preserve"> </w:t>
-      </w:r>
-      <w:r>
-        <w:t>A</w:t>
-      </w:r>
-      <w:r>
-        <w:t>utomated transaction processing and digital receipt generation within the terminal</w:t>
-      </w:r>
-      <w:r>
-        <w:t xml:space="preserve"> </w:t>
-      </w:r>
-      <w:r>
-        <w:t xml:space="preserve">is necessary to avoid </w:t>
-      </w:r>
-      <w:r>
-        <w:t xml:space="preserve">long </w:t>
-      </w:r>
-      <w:r>
-        <w:t>waiting time and improve efficiency of rental process.</w:t>
-      </w:r>
-    </w:p>
-    <w:p>
-      <w:r>
-        <w:t xml:space="preserve">3.3 </w:t>
-      </w:r>
-      <w:r>
-        <w:t xml:space="preserve">Solution for </w:t>
-      </w:r>
-      <w:r>
-        <w:t>Stagnant Pricing Models Affecting Profits</w:t>
-      </w:r>
-    </w:p>
-    <w:p>
-      <w:r>
-        <w:t xml:space="preserve">Define an </w:t>
+        <w:t>abstract</w:t>
+      </w:r>
+      <w:r>
+        <w:t xml:space="preserve"> method virtual double calculateRentalFee(int days) const = 0, inside a base class or interface. Derived classes override this to apply dynamic pricing strategies, such as LuxuryCar includes mandatory security deposits and premium insurance rates, then long-term rentals automatically trigger a percentage discount inside the calculation function.</w:t>
+      </w:r>
+      <w:r>
+        <w:t xml:space="preserve"> Adjust the prices automatically based on seasonality is also can be consider, dynamic pricing can optimize revenue and ensure staying competitive in the market.</w:t>
+      </w:r>
+    </w:p>
+    <w:p>
+      <w:r>
+        <w:t xml:space="preserve">3.4 Solution for </w:t>
+      </w:r>
+      <w:r>
+        <w:t>Lack of Fleet Visibility and Status Tracking</w:t>
+      </w:r>
+    </w:p>
+    <w:p>
+      <w:r>
+        <w:t xml:space="preserve">The application enforces </w:t>
       </w:r>
       <w:r>
         <w:rPr>
           <w:b/>
           <w:bCs/>
         </w:rPr>
-        <w:t>abstract</w:t>
-      </w:r>
-      <w:r>
-        <w:t xml:space="preserve"> method virtual double </w:t>
-      </w:r>
-      <w:proofErr w:type="spellStart"/>
-      <w:proofErr w:type="gramStart"/>
-      <w:r>
-        <w:t>calculateRentalFee</w:t>
-      </w:r>
-      <w:proofErr w:type="spellEnd"/>
-      <w:r>
-        <w:t>(</w:t>
-      </w:r>
-      <w:proofErr w:type="gramEnd"/>
-      <w:r>
-        <w:t xml:space="preserve">int days) const = 0, inside a base class or interface. Derived classes override this to apply dynamic pricing strategies, such as </w:t>
-      </w:r>
-      <w:proofErr w:type="spellStart"/>
-      <w:r>
-        <w:t>LuxuryCar</w:t>
-      </w:r>
-      <w:proofErr w:type="spellEnd"/>
-      <w:r>
-        <w:t xml:space="preserve"> includes mandatory security deposits and premium insurance rates, then long-term rentals automatically trigger a percentage discount inside the calculation function.</w:t>
-      </w:r>
-      <w:r>
-        <w:t xml:space="preserve"> Adjust the prices automatically based on seasonality is also can be consider, dynamic pricing can optimize revenue and ensure staying competitive in the market.</w:t>
-      </w:r>
-    </w:p>
-    <w:p>
-      <w:r>
-        <w:t xml:space="preserve">3.4 Solution for </w:t>
-      </w:r>
-      <w:r>
-        <w:t>Lack of Fleet Visibility and Status Tracking</w:t>
-      </w:r>
-    </w:p>
-    <w:p>
-      <w:r>
-        <w:t xml:space="preserve">The application enforces </w:t>
+        <w:t>encapsulation</w:t>
+      </w:r>
+      <w:r>
+        <w:t xml:space="preserve"> by declaring vehicle attributes</w:t>
+      </w:r>
+      <w:r>
+        <w:t xml:space="preserve">, </w:t>
+      </w:r>
+      <w:r>
+        <w:t>such as status, mileage, and assignedCustomer</w:t>
+      </w:r>
+      <w:r>
+        <w:t xml:space="preserve"> </w:t>
+      </w:r>
+      <w:r>
+        <w:t xml:space="preserve">as private or protected, exposing explicit state-transition member functions like rentVehicle(), returnVehicle(), and markUnderMaintenance(). The system implements File Persistence using </w:t>
       </w:r>
       <w:r>
         <w:rPr>
           <w:b/>
           <w:bCs/>
         </w:rPr>
-        <w:t>encapsulation</w:t>
-      </w:r>
-      <w:r>
-        <w:t xml:space="preserve"> by declaring vehicle attributes</w:t>
-      </w:r>
-      <w:r>
-        <w:t xml:space="preserve">, </w:t>
-      </w:r>
-      <w:r>
-        <w:t xml:space="preserve">such as status, mileage, and </w:t>
-      </w:r>
-      <w:proofErr w:type="spellStart"/>
-      <w:r>
-        <w:t>assignedCustomer</w:t>
-      </w:r>
-      <w:proofErr w:type="spellEnd"/>
-      <w:r>
-        <w:t xml:space="preserve"> </w:t>
-      </w:r>
-      <w:r>
-        <w:t xml:space="preserve">as private or protected, exposing explicit state-transition member functions like </w:t>
-      </w:r>
-      <w:proofErr w:type="spellStart"/>
-      <w:proofErr w:type="gramStart"/>
-      <w:r>
-        <w:t>rentVehicle</w:t>
-      </w:r>
-      <w:proofErr w:type="spellEnd"/>
-      <w:r>
-        <w:t>(</w:t>
-      </w:r>
-      <w:proofErr w:type="gramEnd"/>
-      <w:r>
-        <w:t xml:space="preserve">), </w:t>
-      </w:r>
-      <w:proofErr w:type="spellStart"/>
-      <w:proofErr w:type="gramStart"/>
-      <w:r>
-        <w:t>returnVehicle</w:t>
-      </w:r>
-      <w:proofErr w:type="spellEnd"/>
-      <w:r>
-        <w:t>(</w:t>
-      </w:r>
-      <w:proofErr w:type="gramEnd"/>
-      <w:r>
-        <w:t xml:space="preserve">), and </w:t>
-      </w:r>
-      <w:proofErr w:type="spellStart"/>
-      <w:proofErr w:type="gramStart"/>
-      <w:r>
-        <w:t>markUnderMaintenance</w:t>
-      </w:r>
-      <w:proofErr w:type="spellEnd"/>
-      <w:r>
-        <w:t>(</w:t>
-      </w:r>
-      <w:proofErr w:type="gramEnd"/>
-      <w:r>
-        <w:t xml:space="preserve">). The system implements File Persistence using </w:t>
-      </w:r>
-      <w:proofErr w:type="gramStart"/>
+        <w:t>std::ifstream</w:t>
+      </w:r>
+      <w:r>
+        <w:t xml:space="preserve"> and </w:t>
+      </w:r>
       <w:r>
         <w:rPr>
           <w:b/>
           <w:bCs/>
         </w:rPr>
-        <w:t>std::</w:t>
-      </w:r>
-      <w:proofErr w:type="spellStart"/>
-      <w:proofErr w:type="gramEnd"/>
-      <w:r>
-        <w:rPr>
-          <w:b/>
-          <w:bCs/>
-        </w:rPr>
-        <w:t>ifstream</w:t>
-      </w:r>
-      <w:proofErr w:type="spellEnd"/>
-      <w:r>
-        <w:t xml:space="preserve"> and </w:t>
-      </w:r>
-      <w:proofErr w:type="gramStart"/>
-      <w:r>
-        <w:rPr>
-          <w:b/>
-          <w:bCs/>
-        </w:rPr>
-        <w:t>std::</w:t>
-      </w:r>
-      <w:proofErr w:type="spellStart"/>
-      <w:proofErr w:type="gramEnd"/>
-      <w:r>
-        <w:rPr>
-          <w:b/>
-          <w:bCs/>
-        </w:rPr>
-        <w:t>ofstream</w:t>
-      </w:r>
-      <w:proofErr w:type="spellEnd"/>
+        <w:t>std::ofstream</w:t>
+      </w:r>
       <w:r>
         <w:t xml:space="preserve"> to read and write vehicle states to external storage files (vehicles.txt), preserving complete maintenance logs and service histories across application restarts. Role-based menu options allow administrators to monitor real-time fleet status and maintenance alerts while limiting customer views to their active transactions.</w:t>
       </w:r>
@@ -776,6 +1051,7 @@
           <w:szCs w:val="32"/>
         </w:rPr>
       </w:pPr>
+      <w:bookmarkStart w:id="3" w:name="_Toc241497198"/>
       <w:r>
         <w:rPr>
           <w:sz w:val="32"/>
@@ -791,6 +1067,7 @@
         </w:rPr>
         <w:t>Proposed System Features</w:t>
       </w:r>
+      <w:bookmarkEnd w:id="3"/>
     </w:p>
     <w:p>
       <w:r>
@@ -888,41 +1165,7 @@
         <w:t xml:space="preserve">Real-time vehicle availability management powered by STL containers </w:t>
       </w:r>
       <w:r>
-        <w:t>(</w:t>
-      </w:r>
-      <w:proofErr w:type="gramStart"/>
-      <w:r>
-        <w:t>std::</w:t>
-      </w:r>
-      <w:proofErr w:type="spellStart"/>
-      <w:proofErr w:type="gramEnd"/>
-      <w:r>
-        <w:t>unordered_map</w:t>
-      </w:r>
-      <w:proofErr w:type="spellEnd"/>
-      <w:r>
-        <w:t xml:space="preserve"> / </w:t>
-      </w:r>
-      <w:proofErr w:type="gramStart"/>
-      <w:r>
-        <w:t>std::</w:t>
-      </w:r>
-      <w:proofErr w:type="gramEnd"/>
-      <w:r>
-        <w:t xml:space="preserve">vector with </w:t>
-      </w:r>
-      <w:proofErr w:type="gramStart"/>
-      <w:r>
-        <w:t>std::</w:t>
-      </w:r>
-      <w:proofErr w:type="spellStart"/>
-      <w:proofErr w:type="gramEnd"/>
-      <w:r>
-        <w:t>find_if</w:t>
-      </w:r>
-      <w:proofErr w:type="spellEnd"/>
-      <w:r>
-        <w:t>) using License Plate or Vehicle ID.</w:t>
+        <w:t>(std::unordered_map / std::vector with std::find_if) using License Plate or Vehicle ID.</w:t>
       </w:r>
     </w:p>
     <w:p>
@@ -1003,9 +1246,6 @@
           <w:ilvl w:val="0"/>
           <w:numId w:val="3"/>
         </w:numPr>
-        <w:rPr>
-          <w:rFonts w:hint="eastAsia"/>
-        </w:rPr>
       </w:pPr>
       <w:r>
         <w:t>Tier-Specific Fees: Adds security deposits, luxury charges, and insurance fees for higher-tier vehicles</w:t>
@@ -1140,6 +1380,7 @@
           <w:szCs w:val="32"/>
         </w:rPr>
       </w:pPr>
+      <w:bookmarkStart w:id="4" w:name="_Toc241497199"/>
       <w:r>
         <w:rPr>
           <w:sz w:val="32"/>
@@ -1148,12 +1389,13 @@
         <w:lastRenderedPageBreak/>
         <w:t xml:space="preserve">5.0 </w:t>
       </w:r>
+      <w:bookmarkEnd w:id="4"/>
       <w:r>
         <w:rPr>
           <w:sz w:val="32"/>
           <w:szCs w:val="32"/>
         </w:rPr>
-        <w:t>Expected Outcome</w:t>
+        <w:t>Target User</w:t>
       </w:r>
     </w:p>
     <w:p>
@@ -1169,40 +1411,61 @@
           <w:szCs w:val="32"/>
         </w:rPr>
       </w:pPr>
+      <w:bookmarkStart w:id="5" w:name="_Toc241497200"/>
       <w:r>
         <w:rPr>
           <w:sz w:val="32"/>
           <w:szCs w:val="32"/>
         </w:rPr>
         <w:lastRenderedPageBreak/>
-        <w:t>6.0 Conclusion</w:t>
-      </w:r>
-    </w:p>
-    <w:p>
-      <w:r>
-        <w:br w:type="page"/>
-      </w:r>
-    </w:p>
-    <w:p>
-      <w:pPr>
-        <w:pStyle w:val="Heading1"/>
+        <w:t xml:space="preserve">6.0 </w:t>
+      </w:r>
+      <w:bookmarkEnd w:id="5"/>
+      <w:r>
         <w:rPr>
           <w:sz w:val="32"/>
           <w:szCs w:val="32"/>
         </w:rPr>
-      </w:pPr>
-      <w:r>
+        <w:t>Proposed Classes</w:t>
+      </w:r>
+    </w:p>
+    <w:p>
+      <w:r>
+        <w:br w:type="page"/>
+      </w:r>
+    </w:p>
+    <w:p>
+      <w:pPr>
+        <w:pStyle w:val="Heading1"/>
         <w:rPr>
           <w:sz w:val="32"/>
           <w:szCs w:val="32"/>
         </w:rPr>
+      </w:pPr>
+      <w:bookmarkStart w:id="6" w:name="_Toc241497201"/>
+      <w:r>
+        <w:rPr>
+          <w:sz w:val="32"/>
+          <w:szCs w:val="32"/>
+        </w:rPr>
         <w:lastRenderedPageBreak/>
         <w:t>7.0 References</w:t>
       </w:r>
-    </w:p>
-    <w:p>
-      <w:r>
-        <w:t>https://www.coastr.com/post/expert-solutions-to-the-7-most-common-vehicle-rental-business-challenges</w:t>
+      <w:bookmarkEnd w:id="6"/>
+    </w:p>
+    <w:p>
+      <w:hyperlink r:id="rId7" w:history="1">
+        <w:r>
+          <w:rPr>
+            <w:rStyle w:val="Hyperlink"/>
+          </w:rPr>
+          <w:t>https://www.coastr.com/post/expert-solutions-to-the-7-most-common-vehicle-rental-business-challenges</w:t>
+        </w:r>
+      </w:hyperlink>
+    </w:p>
+    <w:p>
+      <w:r>
+        <w:t>https://www.linkedin.com/pulse/car-rental-system-yaswanth-borra/</w:t>
       </w:r>
     </w:p>
     <w:sectPr>
@@ -2403,6 +2666,7 @@
   <w:style w:type="character" w:default="1" w:styleId="DefaultParagraphFont">
     <w:name w:val="Default Paragraph Font"/>
     <w:uiPriority w:val="1"/>
+    <w:semiHidden/>
     <w:unhideWhenUsed/>
   </w:style>
   <w:style w:type="table" w:default="1" w:styleId="TableNormal">
@@ -2734,6 +2998,41 @@
       <w:szCs w:val="32"/>
       <w:lang w:eastAsia="en-US"/>
       <w14:ligatures w14:val="none"/>
+    </w:rPr>
+  </w:style>
+  <w:style w:type="paragraph" w:styleId="TOC1">
+    <w:name w:val="toc 1"/>
+    <w:basedOn w:val="Normal"/>
+    <w:next w:val="Normal"/>
+    <w:autoRedefine/>
+    <w:uiPriority w:val="39"/>
+    <w:unhideWhenUsed/>
+    <w:rsid w:val="000A59CC"/>
+    <w:pPr>
+      <w:spacing w:after="100"/>
+    </w:pPr>
+  </w:style>
+  <w:style w:type="character" w:styleId="Hyperlink">
+    <w:name w:val="Hyperlink"/>
+    <w:basedOn w:val="DefaultParagraphFont"/>
+    <w:uiPriority w:val="99"/>
+    <w:unhideWhenUsed/>
+    <w:rsid w:val="000A59CC"/>
+    <w:rPr>
+      <w:color w:val="467886" w:themeColor="hyperlink"/>
+      <w:u w:val="single"/>
+    </w:rPr>
+  </w:style>
+  <w:style w:type="character" w:styleId="UnresolvedMention">
+    <w:name w:val="Unresolved Mention"/>
+    <w:basedOn w:val="DefaultParagraphFont"/>
+    <w:uiPriority w:val="99"/>
+    <w:semiHidden/>
+    <w:unhideWhenUsed/>
+    <w:rsid w:val="007724BE"/>
+    <w:rPr>
+      <w:color w:val="605E5C"/>
+      <w:shd w:val="clear" w:color="auto" w:fill="E1DFDD"/>
     </w:rPr>
   </w:style>
 </w:styles>

</xml_diff>

<commit_message>
docs: update project proposal with use case diagram
</commit_message>
<xml_diff>
--- a/Project Proposal.docx
+++ b/Project Proposal.docx
@@ -203,7 +203,7 @@
           <w:r>
             <w:fldChar w:fldCharType="separate"/>
           </w:r>
-          <w:hyperlink w:anchor="_Toc241587317" w:history="1">
+          <w:hyperlink w:anchor="_Toc241673295" w:history="1">
             <w:r>
               <w:rPr>
                 <w:rStyle w:val="Hyperlink"/>
@@ -230,7 +230,7 @@
                 <w:noProof/>
                 <w:webHidden/>
               </w:rPr>
-              <w:instrText xml:space="preserve"> PAGEREF _Toc241587317 \h </w:instrText>
+              <w:instrText xml:space="preserve"> PAGEREF _Toc241673295 \h </w:instrText>
             </w:r>
             <w:r>
               <w:rPr>
@@ -271,7 +271,7 @@
               <w:noProof/>
             </w:rPr>
           </w:pPr>
-          <w:hyperlink w:anchor="_Toc241587318" w:history="1">
+          <w:hyperlink w:anchor="_Toc241673296" w:history="1">
             <w:r>
               <w:rPr>
                 <w:rStyle w:val="Hyperlink"/>
@@ -298,7 +298,7 @@
                 <w:noProof/>
                 <w:webHidden/>
               </w:rPr>
-              <w:instrText xml:space="preserve"> PAGEREF _Toc241587318 \h </w:instrText>
+              <w:instrText xml:space="preserve"> PAGEREF _Toc241673296 \h </w:instrText>
             </w:r>
             <w:r>
               <w:rPr>
@@ -339,7 +339,7 @@
               <w:noProof/>
             </w:rPr>
           </w:pPr>
-          <w:hyperlink w:anchor="_Toc241587319" w:history="1">
+          <w:hyperlink w:anchor="_Toc241673297" w:history="1">
             <w:r>
               <w:rPr>
                 <w:rStyle w:val="Hyperlink"/>
@@ -366,7 +366,7 @@
                 <w:noProof/>
                 <w:webHidden/>
               </w:rPr>
-              <w:instrText xml:space="preserve"> PAGEREF _Toc241587319 \h </w:instrText>
+              <w:instrText xml:space="preserve"> PAGEREF _Toc241673297 \h </w:instrText>
             </w:r>
             <w:r>
               <w:rPr>
@@ -407,7 +407,7 @@
               <w:noProof/>
             </w:rPr>
           </w:pPr>
-          <w:hyperlink w:anchor="_Toc241587320" w:history="1">
+          <w:hyperlink w:anchor="_Toc241673298" w:history="1">
             <w:r>
               <w:rPr>
                 <w:rStyle w:val="Hyperlink"/>
@@ -434,7 +434,7 @@
                 <w:noProof/>
                 <w:webHidden/>
               </w:rPr>
-              <w:instrText xml:space="preserve"> PAGEREF _Toc241587320 \h </w:instrText>
+              <w:instrText xml:space="preserve"> PAGEREF _Toc241673298 \h </w:instrText>
             </w:r>
             <w:r>
               <w:rPr>
@@ -475,7 +475,7 @@
               <w:noProof/>
             </w:rPr>
           </w:pPr>
-          <w:hyperlink w:anchor="_Toc241587321" w:history="1">
+          <w:hyperlink w:anchor="_Toc241673299" w:history="1">
             <w:r>
               <w:rPr>
                 <w:rStyle w:val="Hyperlink"/>
@@ -502,7 +502,7 @@
                 <w:noProof/>
                 <w:webHidden/>
               </w:rPr>
-              <w:instrText xml:space="preserve"> PAGEREF _Toc241587321 \h </w:instrText>
+              <w:instrText xml:space="preserve"> PAGEREF _Toc241673299 \h </w:instrText>
             </w:r>
             <w:r>
               <w:rPr>
@@ -543,7 +543,7 @@
               <w:noProof/>
             </w:rPr>
           </w:pPr>
-          <w:hyperlink w:anchor="_Toc241587322" w:history="1">
+          <w:hyperlink w:anchor="_Toc241673300" w:history="1">
             <w:r>
               <w:rPr>
                 <w:rStyle w:val="Hyperlink"/>
@@ -570,7 +570,7 @@
                 <w:noProof/>
                 <w:webHidden/>
               </w:rPr>
-              <w:instrText xml:space="preserve"> PAGEREF _Toc241587322 \h </w:instrText>
+              <w:instrText xml:space="preserve"> PAGEREF _Toc241673300 \h </w:instrText>
             </w:r>
             <w:r>
               <w:rPr>
@@ -611,7 +611,7 @@
               <w:noProof/>
             </w:rPr>
           </w:pPr>
-          <w:hyperlink w:anchor="_Toc241587323" w:history="1">
+          <w:hyperlink w:anchor="_Toc241673301" w:history="1">
             <w:r>
               <w:rPr>
                 <w:rStyle w:val="Hyperlink"/>
@@ -638,7 +638,7 @@
                 <w:noProof/>
                 <w:webHidden/>
               </w:rPr>
-              <w:instrText xml:space="preserve"> PAGEREF _Toc241587323 \h </w:instrText>
+              <w:instrText xml:space="preserve"> PAGEREF _Toc241673301 \h </w:instrText>
             </w:r>
             <w:r>
               <w:rPr>
@@ -658,7 +658,7 @@
                 <w:noProof/>
                 <w:webHidden/>
               </w:rPr>
-              <w:t>11</w:t>
+              <w:t>12</w:t>
             </w:r>
             <w:r>
               <w:rPr>
@@ -704,7 +704,7 @@
           <w:szCs w:val="20"/>
         </w:rPr>
       </w:pPr>
-      <w:bookmarkStart w:id="0" w:name="_Toc241587317"/>
+      <w:bookmarkStart w:id="0" w:name="_Toc241673295"/>
       <w:r>
         <w:rPr>
           <w:sz w:val="32"/>
@@ -727,7 +727,10 @@
         <w:jc w:val="both"/>
       </w:pPr>
       <w:r>
-        <w:t>This project is going to develop a car rental software application by applying the C++ Programming and Object-Oriented Programming (OOP) concepts learned. Since we also need a Graphic User Interface (GUI) for end user to interact with the system, so we will use HTML, CSS and JavaScript to develop the frontend as GUI.</w:t>
+        <w:t xml:space="preserve">This project is going to develop a car rental software application by applying the C++ Programming and Object-Oriented Programming (OOP) concepts learned. </w:t>
+      </w:r>
+      <w:r>
+        <w:t>The frontend interface will be developed using HTML, CSS, and JavaScript to provide an intuitive Graphical User Interface (GUI) for end-users and administrators.</w:t>
       </w:r>
       <w:r>
         <w:t xml:space="preserve"> The objective of this project is to develop a functional Car Rental Management System using C++ that applies fundamental programming concepts and object-oriented programming principles. The system will demonstrate the use of classes, objects, encapsulation, abstraction, inheritance, and polymorphism, while applying appropriate data structures and algorithms to manage cars, customers, bookings, and rental fees. This project also aims to provide practical experience in developing, testing, and debugging a functional C++ application.</w:t>
@@ -744,7 +747,7 @@
           <w:szCs w:val="32"/>
         </w:rPr>
       </w:pPr>
-      <w:bookmarkStart w:id="1" w:name="_Toc241587318"/>
+      <w:bookmarkStart w:id="1" w:name="_Toc241673296"/>
       <w:r>
         <w:rPr>
           <w:sz w:val="32"/>
@@ -854,7 +857,7 @@
           <w:szCs w:val="32"/>
         </w:rPr>
       </w:pPr>
-      <w:bookmarkStart w:id="2" w:name="_Toc241587319"/>
+      <w:bookmarkStart w:id="2" w:name="_Toc241673297"/>
       <w:r>
         <w:rPr>
           <w:sz w:val="32"/>
@@ -1312,7 +1315,7 @@
           <w:szCs w:val="32"/>
         </w:rPr>
       </w:pPr>
-      <w:bookmarkStart w:id="3" w:name="_Toc241587320"/>
+      <w:bookmarkStart w:id="3" w:name="_Toc241673298"/>
       <w:r>
         <w:rPr>
           <w:sz w:val="32"/>
@@ -1713,7 +1716,7 @@
           <w:szCs w:val="32"/>
         </w:rPr>
       </w:pPr>
-      <w:bookmarkStart w:id="4" w:name="_Toc241587321"/>
+      <w:bookmarkStart w:id="4" w:name="_Toc241673299"/>
       <w:r>
         <w:rPr>
           <w:sz w:val="32"/>
@@ -1755,10 +1758,7 @@
         <w:jc w:val="both"/>
       </w:pPr>
       <w:r>
-        <w:t>The second target group consists of rental agency staff and system administrators who are responsible for managing daily fleet operations and rental activities. Through an administrative interface, they have access to fleet management functions, including searching for vehicles, updating vehicle status such as available, rented, or under maintenance, and managing rental transactions. Administrators can also use automatic calculation functions to calculate daily rental costs and damage fees, maintain vehicle inspection records, manage customer sign-offs, and keep system records by saving and loading data from files.</w:t>
-      </w:r>
-      <w:r>
-        <w:t xml:space="preserve"> </w:t>
+        <w:t xml:space="preserve">The second target group consists of rental agency staff and system administrators who are responsible for managing daily fleet operations and rental activities. Through an administrative interface, they have access to fleet management functions, including searching for vehicles, updating vehicle status such as available, rented, or under maintenance, and managing rental transactions. Administrators can also use automatic calculation functions to calculate daily rental costs and damage fees, maintain vehicle inspection records, manage customer sign-offs, and keep system records by saving and loading data from files. </w:t>
       </w:r>
       <w:r>
         <w:br w:type="page"/>
@@ -1772,7 +1772,7 @@
           <w:szCs w:val="32"/>
         </w:rPr>
       </w:pPr>
-      <w:bookmarkStart w:id="5" w:name="_Toc241587322"/>
+      <w:bookmarkStart w:id="5" w:name="_Toc241673300"/>
       <w:r>
         <w:rPr>
           <w:sz w:val="32"/>
@@ -1795,6 +1795,9 @@
         <w:keepNext/>
       </w:pPr>
       <w:r>
+        <w:rPr>
+          <w:noProof/>
+        </w:rPr>
         <w:drawing>
           <wp:inline distT="0" distB="0" distL="0" distR="0" wp14:anchorId="4644D646" wp14:editId="5F84EC6B">
             <wp:extent cx="5943600" cy="3823335"/>
@@ -1840,34 +1843,27 @@
       <w:r>
         <w:t xml:space="preserve">Figure </w:t>
       </w:r>
-      <w:r>
-        <w:fldChar w:fldCharType="begin"/>
-      </w:r>
-      <w:r>
-        <w:instrText xml:space="preserve"> SEQ Figure \* ARABIC </w:instrText>
-      </w:r>
-      <w:r>
-        <w:fldChar w:fldCharType="separate"/>
-      </w:r>
+      <w:fldSimple w:instr=" SEQ Figure \* ARABIC ">
+        <w:r>
+          <w:rPr>
+            <w:noProof/>
+          </w:rPr>
+          <w:t>1</w:t>
+        </w:r>
+      </w:fldSimple>
+      <w:r>
+        <w:t xml:space="preserve"> UML Diagram</w:t>
+      </w:r>
+    </w:p>
+    <w:p>
+      <w:pPr>
+        <w:keepNext/>
+        <w:jc w:val="center"/>
+      </w:pPr>
       <w:r>
         <w:rPr>
           <w:noProof/>
         </w:rPr>
-        <w:t>1</w:t>
-      </w:r>
-      <w:r>
-        <w:fldChar w:fldCharType="end"/>
-      </w:r>
-      <w:r>
-        <w:t xml:space="preserve"> UML Diagram</w:t>
-      </w:r>
-    </w:p>
-    <w:p>
-      <w:pPr>
-        <w:keepNext/>
-        <w:jc w:val="center"/>
-      </w:pPr>
-      <w:r>
         <w:lastRenderedPageBreak/>
         <w:drawing>
           <wp:inline distT="0" distB="0" distL="0" distR="0" wp14:anchorId="28E7981D" wp14:editId="332B114E">
@@ -1914,26 +1910,84 @@
       <w:r>
         <w:t xml:space="preserve">Figure </w:t>
       </w:r>
-      <w:r>
-        <w:fldChar w:fldCharType="begin"/>
-      </w:r>
-      <w:r>
-        <w:instrText xml:space="preserve"> SEQ Figure \* ARABIC </w:instrText>
-      </w:r>
-      <w:r>
-        <w:fldChar w:fldCharType="separate"/>
-      </w:r>
-      <w:r>
-        <w:rPr>
-          <w:noProof/>
-        </w:rPr>
-        <w:t>2</w:t>
-      </w:r>
-      <w:r>
-        <w:fldChar w:fldCharType="end"/>
-      </w:r>
+      <w:fldSimple w:instr=" SEQ Figure \* ARABIC ">
+        <w:r>
+          <w:rPr>
+            <w:noProof/>
+          </w:rPr>
+          <w:t>2</w:t>
+        </w:r>
+      </w:fldSimple>
       <w:r>
         <w:t xml:space="preserve"> ER Diagram</w:t>
+      </w:r>
+    </w:p>
+    <w:p>
+      <w:r>
+        <w:br w:type="page"/>
+      </w:r>
+    </w:p>
+    <w:p>
+      <w:pPr>
+        <w:keepNext/>
+      </w:pPr>
+      <w:r>
+        <w:lastRenderedPageBreak/>
+        <w:drawing>
+          <wp:inline distT="0" distB="0" distL="0" distR="0" wp14:anchorId="13F6EDE5" wp14:editId="741D2297">
+            <wp:extent cx="5943600" cy="6273165"/>
+            <wp:effectExtent l="0" t="0" r="0" b="0"/>
+            <wp:docPr id="1148053902" name="Picture 1"/>
+            <wp:cNvGraphicFramePr>
+              <a:graphicFrameLocks xmlns:a="http://schemas.openxmlformats.org/drawingml/2006/main" noChangeAspect="1"/>
+            </wp:cNvGraphicFramePr>
+            <a:graphic xmlns:a="http://schemas.openxmlformats.org/drawingml/2006/main">
+              <a:graphicData uri="http://schemas.openxmlformats.org/drawingml/2006/picture">
+                <pic:pic xmlns:pic="http://schemas.openxmlformats.org/drawingml/2006/picture">
+                  <pic:nvPicPr>
+                    <pic:cNvPr id="1148053902" name=""/>
+                    <pic:cNvPicPr/>
+                  </pic:nvPicPr>
+                  <pic:blipFill>
+                    <a:blip r:embed="rId12"/>
+                    <a:stretch>
+                      <a:fillRect/>
+                    </a:stretch>
+                  </pic:blipFill>
+                  <pic:spPr>
+                    <a:xfrm>
+                      <a:off x="0" y="0"/>
+                      <a:ext cx="5943600" cy="6273165"/>
+                    </a:xfrm>
+                    <a:prstGeom prst="rect">
+                      <a:avLst/>
+                    </a:prstGeom>
+                  </pic:spPr>
+                </pic:pic>
+              </a:graphicData>
+            </a:graphic>
+          </wp:inline>
+        </w:drawing>
+      </w:r>
+    </w:p>
+    <w:p>
+      <w:pPr>
+        <w:pStyle w:val="Caption"/>
+        <w:jc w:val="center"/>
+      </w:pPr>
+      <w:r>
+        <w:t xml:space="preserve">Figure </w:t>
+      </w:r>
+      <w:fldSimple w:instr=" SEQ Figure \* ARABIC ">
+        <w:r>
+          <w:rPr>
+            <w:noProof/>
+          </w:rPr>
+          <w:t>3</w:t>
+        </w:r>
+      </w:fldSimple>
+      <w:r>
+        <w:t xml:space="preserve"> Use Case Diagram</w:t>
       </w:r>
     </w:p>
     <w:p>
@@ -1951,24 +2005,14 @@
         <w:lastRenderedPageBreak/>
         <w:t xml:space="preserve">Table </w:t>
       </w:r>
-      <w:r>
-        <w:fldChar w:fldCharType="begin"/>
-      </w:r>
-      <w:r>
-        <w:instrText xml:space="preserve"> SEQ Table \* ARABIC </w:instrText>
-      </w:r>
-      <w:r>
-        <w:fldChar w:fldCharType="separate"/>
-      </w:r>
-      <w:r>
-        <w:rPr>
-          <w:noProof/>
-        </w:rPr>
-        <w:t>1</w:t>
-      </w:r>
-      <w:r>
-        <w:fldChar w:fldCharType="end"/>
-      </w:r>
+      <w:fldSimple w:instr=" SEQ Table \* ARABIC ">
+        <w:r>
+          <w:rPr>
+            <w:noProof/>
+          </w:rPr>
+          <w:t>1</w:t>
+        </w:r>
+      </w:fldSimple>
       <w:r>
         <w:t xml:space="preserve"> Classes and Functions</w:t>
       </w:r>
@@ -3110,7 +3154,7 @@
           <w:szCs w:val="32"/>
         </w:rPr>
       </w:pPr>
-      <w:bookmarkStart w:id="6" w:name="_Toc241587323"/>
+      <w:bookmarkStart w:id="6" w:name="_Toc241673301"/>
       <w:r>
         <w:rPr>
           <w:sz w:val="32"/>
@@ -3122,7 +3166,7 @@
       <w:bookmarkEnd w:id="6"/>
     </w:p>
     <w:p>
-      <w:hyperlink r:id="rId12" w:history="1">
+      <w:hyperlink r:id="rId13" w:history="1">
         <w:r>
           <w:rPr>
             <w:rStyle w:val="Hyperlink"/>
@@ -3132,12 +3176,28 @@
       </w:hyperlink>
     </w:p>
     <w:p>
-      <w:r>
-        <w:t>https://www.linkedin.com/pulse/car-rental-system-yaswanth-borra/</w:t>
-      </w:r>
-    </w:p>
+      <w:hyperlink r:id="rId14" w:history="1">
+        <w:r>
+          <w:rPr>
+            <w:rStyle w:val="Hyperlink"/>
+          </w:rPr>
+          <w:t>https://www.visual-paradigm.com/guide/uml-unified-modeling-language/what-is-use-case-diagram/</w:t>
+        </w:r>
+      </w:hyperlink>
+    </w:p>
+    <w:p>
+      <w:hyperlink r:id="rId15" w:history="1">
+        <w:r>
+          <w:rPr>
+            <w:rStyle w:val="Hyperlink"/>
+          </w:rPr>
+          <w:t>https://www.visual-paradigm.com/guide/uml-unified-modeling-language/uml-class-diagram-tutorial/</w:t>
+        </w:r>
+      </w:hyperlink>
+    </w:p>
+    <w:p/>
     <w:sectPr>
-      <w:footerReference w:type="default" r:id="rId13"/>
+      <w:footerReference w:type="default" r:id="rId16"/>
       <w:pgSz w:w="12240" w:h="15840"/>
       <w:pgMar w:top="1440" w:right="1440" w:bottom="1440" w:left="1440" w:header="720" w:footer="720" w:gutter="0"/>
       <w:pgNumType w:start="1"/>
@@ -4473,6 +4533,7 @@
   <w:style w:type="character" w:default="1" w:styleId="DefaultParagraphFont">
     <w:name w:val="Default Paragraph Font"/>
     <w:uiPriority w:val="1"/>
+    <w:semiHidden/>
     <w:unhideWhenUsed/>
   </w:style>
   <w:style w:type="table" w:default="1" w:styleId="TableNormal">

</xml_diff>

<commit_message>
docs: update use case diagram
</commit_message>
<xml_diff>
--- a/Project Proposal.docx
+++ b/Project Proposal.docx
@@ -884,23 +884,7 @@
         <w:jc w:val="both"/>
       </w:pPr>
       <w:r>
-        <w:t xml:space="preserve">Creating a base class Vehicle and derived class such as </w:t>
-      </w:r>
-      <w:proofErr w:type="spellStart"/>
-      <w:r>
-        <w:t>StandardCar</w:t>
-      </w:r>
-      <w:proofErr w:type="spellEnd"/>
-      <w:r>
-        <w:t xml:space="preserve">, </w:t>
-      </w:r>
-      <w:proofErr w:type="spellStart"/>
-      <w:r>
-        <w:t>LuxuryCar</w:t>
-      </w:r>
-      <w:proofErr w:type="spellEnd"/>
-      <w:r>
-        <w:t>, and SUV. Then, implementing a</w:t>
+        <w:t>Creating a base class Vehicle and derived class such as StandardCar, LuxuryCar, and SUV. Then, implementing a</w:t>
       </w:r>
       <w:r>
         <w:t>n</w:t>
@@ -916,23 +900,7 @@
         <w:t>abstract function</w:t>
       </w:r>
       <w:r>
-        <w:t xml:space="preserve"> </w:t>
-      </w:r>
-      <w:proofErr w:type="spellStart"/>
-      <w:r>
-        <w:t>calculateDamageFee</w:t>
-      </w:r>
-      <w:proofErr w:type="spellEnd"/>
-      <w:r>
-        <w:t xml:space="preserve"> (double </w:t>
-      </w:r>
-      <w:proofErr w:type="spellStart"/>
-      <w:r>
-        <w:t>severityScore</w:t>
-      </w:r>
-      <w:proofErr w:type="spellEnd"/>
-      <w:r>
-        <w:t xml:space="preserve">) using </w:t>
+        <w:t xml:space="preserve"> calculateDamageFee (double severityScore) using </w:t>
       </w:r>
       <w:r>
         <w:rPr>
@@ -942,23 +910,7 @@
         <w:t>polymorphism</w:t>
       </w:r>
       <w:r>
-        <w:t xml:space="preserve">. For instance, repairing a scratched </w:t>
-      </w:r>
-      <w:proofErr w:type="spellStart"/>
-      <w:r>
-        <w:t>LuxuryCar</w:t>
-      </w:r>
-      <w:proofErr w:type="spellEnd"/>
-      <w:r>
-        <w:t xml:space="preserve"> computes a higher rate or multiplier than a </w:t>
-      </w:r>
-      <w:proofErr w:type="spellStart"/>
-      <w:r>
-        <w:t>StandardCar</w:t>
-      </w:r>
-      <w:proofErr w:type="spellEnd"/>
-      <w:r>
-        <w:t xml:space="preserve">. Storing inspection logs inside a </w:t>
+        <w:t xml:space="preserve">. For instance, repairing a scratched LuxuryCar computes a higher rate or multiplier than a StandardCar. Storing inspection logs inside a </w:t>
       </w:r>
       <w:proofErr w:type="gramStart"/>
       <w:r>
@@ -966,15 +918,7 @@
       </w:r>
       <w:proofErr w:type="gramEnd"/>
       <w:r>
-        <w:t xml:space="preserve">vector&lt;string&gt; or a custom </w:t>
-      </w:r>
-      <w:proofErr w:type="spellStart"/>
-      <w:r>
-        <w:t>DamageLog</w:t>
-      </w:r>
-      <w:proofErr w:type="spellEnd"/>
-      <w:r>
-        <w:t xml:space="preserve"> object ensures its transparent record-keeping.</w:t>
+        <w:t>vector&lt;string&gt; or a custom DamageLog object ensures its transparent record-keeping.</w:t>
       </w:r>
       <w:r>
         <w:t xml:space="preserve"> Besides, system can automatically </w:t>
@@ -1008,65 +952,17 @@
         <w:jc w:val="both"/>
       </w:pPr>
       <w:r>
-        <w:t xml:space="preserve">Implement a centralized </w:t>
-      </w:r>
-      <w:proofErr w:type="spellStart"/>
-      <w:r>
-        <w:t>RentalSystem</w:t>
-      </w:r>
-      <w:proofErr w:type="spellEnd"/>
-      <w:r>
-        <w:t xml:space="preserve"> class that manages fleet availability in real time. Use STL containers like </w:t>
-      </w:r>
-      <w:proofErr w:type="gramStart"/>
+        <w:t xml:space="preserve">Implement a centralized RentalSystem class that manages fleet availability in real time. Use STL containers like </w:t>
+      </w:r>
       <w:r>
         <w:rPr>
           <w:b/>
           <w:bCs/>
         </w:rPr>
-        <w:t>std::</w:t>
-      </w:r>
-      <w:proofErr w:type="spellStart"/>
-      <w:proofErr w:type="gramEnd"/>
-      <w:r>
-        <w:rPr>
-          <w:b/>
-          <w:bCs/>
-        </w:rPr>
-        <w:t>unordered_map</w:t>
-      </w:r>
-      <w:proofErr w:type="spellEnd"/>
-      <w:r>
-        <w:t xml:space="preserve">&lt;string, Vehicle*&gt; for </w:t>
-      </w:r>
-      <w:proofErr w:type="gramStart"/>
-      <w:r>
-        <w:t>O(</w:t>
-      </w:r>
-      <w:proofErr w:type="gramEnd"/>
-      <w:r>
-        <w:t xml:space="preserve">1) fast lookup by License Plate or Vehicle ID or </w:t>
-      </w:r>
-      <w:proofErr w:type="gramStart"/>
-      <w:r>
-        <w:t>std::</w:t>
-      </w:r>
-      <w:proofErr w:type="gramEnd"/>
-      <w:r>
-        <w:t xml:space="preserve">vector combined with </w:t>
-      </w:r>
-      <w:proofErr w:type="gramStart"/>
-      <w:r>
-        <w:t>std::</w:t>
-      </w:r>
-      <w:proofErr w:type="spellStart"/>
-      <w:proofErr w:type="gramEnd"/>
-      <w:r>
-        <w:t>find_if</w:t>
-      </w:r>
-      <w:proofErr w:type="spellEnd"/>
-      <w:r>
-        <w:t xml:space="preserve"> algorithm.</w:t>
+        <w:t>std::unordered_map</w:t>
+      </w:r>
+      <w:r>
+        <w:t>&lt;string, Vehicle*&gt; for O(1) fast lookup by License Plate or Vehicle ID or std::vector combined with std::find_if algorithm.</w:t>
       </w:r>
       <w:r>
         <w:t xml:space="preserve"> Automated availability state changes (Available </w:t>
@@ -1152,28 +1048,7 @@
         <w:t>abstract</w:t>
       </w:r>
       <w:r>
-        <w:t xml:space="preserve"> method virtual double </w:t>
-      </w:r>
-      <w:proofErr w:type="spellStart"/>
-      <w:proofErr w:type="gramStart"/>
-      <w:r>
-        <w:t>calculateRentalFee</w:t>
-      </w:r>
-      <w:proofErr w:type="spellEnd"/>
-      <w:r>
-        <w:t>(</w:t>
-      </w:r>
-      <w:proofErr w:type="gramEnd"/>
-      <w:r>
-        <w:t xml:space="preserve">int days) const = 0, inside a base class or interface. Derived classes override this to apply dynamic pricing strategies, such as </w:t>
-      </w:r>
-      <w:proofErr w:type="spellStart"/>
-      <w:r>
-        <w:t>LuxuryCar</w:t>
-      </w:r>
-      <w:proofErr w:type="spellEnd"/>
-      <w:r>
-        <w:t xml:space="preserve"> includes mandatory security deposits and premium insurance rates, then long-term rentals automatically trigger a percentage discount inside the calculation function.</w:t>
+        <w:t xml:space="preserve"> method virtual double calculateRentalFee(int days) const = 0, inside a base class or interface. Derived classes override this to apply dynamic pricing strategies, such as LuxuryCar includes mandatory security deposits and premium insurance rates, then long-term rentals automatically trigger a percentage discount inside the calculation function.</w:t>
       </w:r>
       <w:r>
         <w:t xml:space="preserve"> Adjust the prices automatically based on seasonality is also can be consider, dynamic pricing can optimize revenue and ensure staying competitive in the market.</w:t>
@@ -1211,97 +1086,31 @@
         <w:t xml:space="preserve">, </w:t>
       </w:r>
       <w:r>
-        <w:t xml:space="preserve">such as status, mileage, and </w:t>
-      </w:r>
-      <w:proofErr w:type="spellStart"/>
-      <w:r>
-        <w:t>assignedCustomer</w:t>
-      </w:r>
-      <w:proofErr w:type="spellEnd"/>
+        <w:t>such as status, mileage, and assignedCustomer</w:t>
+      </w:r>
       <w:r>
         <w:t xml:space="preserve"> </w:t>
       </w:r>
       <w:r>
-        <w:t xml:space="preserve">as private or protected, exposing explicit state-transition member functions like </w:t>
-      </w:r>
-      <w:proofErr w:type="spellStart"/>
-      <w:proofErr w:type="gramStart"/>
-      <w:r>
-        <w:t>rentVehicle</w:t>
-      </w:r>
-      <w:proofErr w:type="spellEnd"/>
-      <w:r>
-        <w:t>(</w:t>
-      </w:r>
-      <w:proofErr w:type="gramEnd"/>
-      <w:r>
-        <w:t xml:space="preserve">), </w:t>
-      </w:r>
-      <w:proofErr w:type="spellStart"/>
-      <w:proofErr w:type="gramStart"/>
-      <w:r>
-        <w:t>returnVehicle</w:t>
-      </w:r>
-      <w:proofErr w:type="spellEnd"/>
-      <w:r>
-        <w:t>(</w:t>
-      </w:r>
-      <w:proofErr w:type="gramEnd"/>
-      <w:r>
-        <w:t xml:space="preserve">), and </w:t>
-      </w:r>
-      <w:proofErr w:type="spellStart"/>
-      <w:proofErr w:type="gramStart"/>
-      <w:r>
-        <w:t>markUnderMaintenance</w:t>
-      </w:r>
-      <w:proofErr w:type="spellEnd"/>
-      <w:r>
-        <w:t>(</w:t>
-      </w:r>
-      <w:proofErr w:type="gramEnd"/>
-      <w:r>
-        <w:t xml:space="preserve">). The system implements File Persistence using </w:t>
-      </w:r>
-      <w:proofErr w:type="gramStart"/>
+        <w:t xml:space="preserve">as private or protected, exposing explicit state-transition member functions like rentVehicle(), returnVehicle(), and markUnderMaintenance(). The system implements File Persistence using </w:t>
+      </w:r>
       <w:r>
         <w:rPr>
           <w:b/>
           <w:bCs/>
         </w:rPr>
-        <w:t>std::</w:t>
-      </w:r>
-      <w:proofErr w:type="spellStart"/>
-      <w:proofErr w:type="gramEnd"/>
+        <w:t>std::ifstream</w:t>
+      </w:r>
+      <w:r>
+        <w:t xml:space="preserve"> and </w:t>
+      </w:r>
       <w:r>
         <w:rPr>
           <w:b/>
           <w:bCs/>
         </w:rPr>
-        <w:t>ifstream</w:t>
-      </w:r>
-      <w:proofErr w:type="spellEnd"/>
-      <w:r>
-        <w:t xml:space="preserve"> and </w:t>
-      </w:r>
-      <w:proofErr w:type="gramStart"/>
-      <w:r>
-        <w:rPr>
-          <w:b/>
-          <w:bCs/>
-        </w:rPr>
-        <w:t>std::</w:t>
-      </w:r>
-      <w:proofErr w:type="spellStart"/>
-      <w:proofErr w:type="gramEnd"/>
-      <w:r>
-        <w:rPr>
-          <w:b/>
-          <w:bCs/>
-        </w:rPr>
-        <w:t>ofstream</w:t>
-      </w:r>
-      <w:proofErr w:type="spellEnd"/>
+        <w:t>std::ofstream</w:t>
+      </w:r>
       <w:r>
         <w:t xml:space="preserve"> to read and write vehicle states to external storage files (vehicles.txt), preserving complete maintenance logs and service histories across application restarts. Role-based menu options allow administrators to monitor real-time fleet status and maintenance alerts while limiting customer views to their active transactions.</w:t>
       </w:r>
@@ -1443,41 +1252,7 @@
         <w:t xml:space="preserve">Real-time vehicle availability management powered by STL containers </w:t>
       </w:r>
       <w:r>
-        <w:t>(</w:t>
-      </w:r>
-      <w:proofErr w:type="gramStart"/>
-      <w:r>
-        <w:t>std::</w:t>
-      </w:r>
-      <w:proofErr w:type="spellStart"/>
-      <w:proofErr w:type="gramEnd"/>
-      <w:r>
-        <w:t>unordered_map</w:t>
-      </w:r>
-      <w:proofErr w:type="spellEnd"/>
-      <w:r>
-        <w:t xml:space="preserve"> / </w:t>
-      </w:r>
-      <w:proofErr w:type="gramStart"/>
-      <w:r>
-        <w:t>std::</w:t>
-      </w:r>
-      <w:proofErr w:type="gramEnd"/>
-      <w:r>
-        <w:t xml:space="preserve">vector with </w:t>
-      </w:r>
-      <w:proofErr w:type="gramStart"/>
-      <w:r>
-        <w:t>std::</w:t>
-      </w:r>
-      <w:proofErr w:type="spellStart"/>
-      <w:proofErr w:type="gramEnd"/>
-      <w:r>
-        <w:t>find_if</w:t>
-      </w:r>
-      <w:proofErr w:type="spellEnd"/>
-      <w:r>
-        <w:t>) using License Plate or Vehicle ID.</w:t>
+        <w:t>(std::unordered_map / std::vector with std::find_if) using License Plate or Vehicle ID.</w:t>
       </w:r>
     </w:p>
     <w:p>
@@ -1934,10 +1709,10 @@
       <w:r>
         <w:lastRenderedPageBreak/>
         <w:drawing>
-          <wp:inline distT="0" distB="0" distL="0" distR="0" wp14:anchorId="13F6EDE5" wp14:editId="741D2297">
-            <wp:extent cx="5943600" cy="6273165"/>
-            <wp:effectExtent l="0" t="0" r="0" b="0"/>
-            <wp:docPr id="1148053902" name="Picture 1"/>
+          <wp:inline distT="0" distB="0" distL="0" distR="0" wp14:anchorId="53739B34" wp14:editId="7B7E0D39">
+            <wp:extent cx="5943600" cy="6278245"/>
+            <wp:effectExtent l="0" t="0" r="0" b="8255"/>
+            <wp:docPr id="1482790641" name="Picture 1"/>
             <wp:cNvGraphicFramePr>
               <a:graphicFrameLocks xmlns:a="http://schemas.openxmlformats.org/drawingml/2006/main" noChangeAspect="1"/>
             </wp:cNvGraphicFramePr>
@@ -1945,7 +1720,7 @@
               <a:graphicData uri="http://schemas.openxmlformats.org/drawingml/2006/picture">
                 <pic:pic xmlns:pic="http://schemas.openxmlformats.org/drawingml/2006/picture">
                   <pic:nvPicPr>
-                    <pic:cNvPr id="1148053902" name=""/>
+                    <pic:cNvPr id="1482790641" name=""/>
                     <pic:cNvPicPr/>
                   </pic:nvPicPr>
                   <pic:blipFill>
@@ -1957,7 +1732,7 @@
                   <pic:spPr>
                     <a:xfrm>
                       <a:off x="0" y="0"/>
-                      <a:ext cx="5943600" cy="6273165"/>
+                      <a:ext cx="5943600" cy="6278245"/>
                     </a:xfrm>
                     <a:prstGeom prst="rect">
                       <a:avLst/>
@@ -2138,11 +1913,9 @@
             <w:tcW w:w="1696" w:type="dxa"/>
           </w:tcPr>
           <w:p>
-            <w:proofErr w:type="spellStart"/>
             <w:r>
               <w:t>RentalSystem</w:t>
             </w:r>
-            <w:proofErr w:type="spellEnd"/>
           </w:p>
         </w:tc>
         <w:tc>
@@ -2150,14 +1923,9 @@
             <w:tcW w:w="2268" w:type="dxa"/>
           </w:tcPr>
           <w:p>
-            <w:proofErr w:type="spellStart"/>
             <w:proofErr w:type="gramStart"/>
             <w:r>
-              <w:t>lookupVehicle</w:t>
-            </w:r>
-            <w:proofErr w:type="spellEnd"/>
-            <w:r>
-              <w:t>(</w:t>
+              <w:t>lookupVehicle(</w:t>
             </w:r>
             <w:proofErr w:type="gramEnd"/>
             <w:r>
@@ -2189,23 +1957,7 @@
           </w:tcPr>
           <w:p>
             <w:r>
-              <w:t xml:space="preserve">Searches </w:t>
-            </w:r>
-            <w:proofErr w:type="spellStart"/>
-            <w:r>
-              <w:t>vehicleMap</w:t>
-            </w:r>
-            <w:proofErr w:type="spellEnd"/>
-            <w:r>
-              <w:t xml:space="preserve"> or </w:t>
-            </w:r>
-            <w:proofErr w:type="spellStart"/>
-            <w:r>
-              <w:t>vehicleList</w:t>
-            </w:r>
-            <w:proofErr w:type="spellEnd"/>
-            <w:r>
-              <w:t xml:space="preserve"> by ID and returns a matching Vehicle* pointer or iterator</w:t>
+              <w:t>Searches vehicleMap or vehicleList by ID and returns a matching Vehicle* pointer or iterator</w:t>
             </w:r>
             <w:r>
               <w:t>.</w:t>
@@ -2225,14 +1977,9 @@
             <w:tcW w:w="2268" w:type="dxa"/>
           </w:tcPr>
           <w:p>
-            <w:proofErr w:type="spellStart"/>
             <w:proofErr w:type="gramStart"/>
             <w:r>
-              <w:t>validateBookingDates</w:t>
-            </w:r>
-            <w:proofErr w:type="spellEnd"/>
-            <w:r>
-              <w:t>(</w:t>
+              <w:t>validateBookingDates(</w:t>
             </w:r>
             <w:proofErr w:type="gramEnd"/>
             <w:r>
@@ -2276,14 +2023,9 @@
             <w:tcW w:w="2268" w:type="dxa"/>
           </w:tcPr>
           <w:p>
-            <w:proofErr w:type="spellStart"/>
             <w:proofErr w:type="gramStart"/>
             <w:r>
-              <w:t>processTransaction</w:t>
-            </w:r>
-            <w:proofErr w:type="spellEnd"/>
-            <w:r>
-              <w:t>(</w:t>
+              <w:t>processTransaction(</w:t>
             </w:r>
             <w:proofErr w:type="gramEnd"/>
             <w:r>
@@ -2327,14 +2069,9 @@
             <w:tcW w:w="2268" w:type="dxa"/>
           </w:tcPr>
           <w:p>
-            <w:proofErr w:type="spellStart"/>
             <w:proofErr w:type="gramStart"/>
             <w:r>
-              <w:t>generateDigitalReceipt</w:t>
-            </w:r>
-            <w:proofErr w:type="spellEnd"/>
-            <w:r>
-              <w:t>(</w:t>
+              <w:t>generateDigitalReceipt(</w:t>
             </w:r>
             <w:proofErr w:type="gramEnd"/>
             <w:r>
@@ -2375,27 +2112,17 @@
             <w:tcW w:w="2268" w:type="dxa"/>
           </w:tcPr>
           <w:p>
-            <w:proofErr w:type="spellStart"/>
             <w:proofErr w:type="gramStart"/>
             <w:r>
-              <w:t>saveToFile</w:t>
-            </w:r>
-            <w:proofErr w:type="spellEnd"/>
-            <w:r>
-              <w:t>(</w:t>
+              <w:t>saveToFile(</w:t>
             </w:r>
             <w:proofErr w:type="gramEnd"/>
             <w:r>
               <w:t xml:space="preserve">) / </w:t>
             </w:r>
-            <w:proofErr w:type="spellStart"/>
             <w:proofErr w:type="gramStart"/>
             <w:r>
-              <w:t>loadFromFile</w:t>
-            </w:r>
-            <w:proofErr w:type="spellEnd"/>
-            <w:r>
-              <w:t>(</w:t>
+              <w:t>loadFromFile(</w:t>
             </w:r>
             <w:proofErr w:type="gramEnd"/>
             <w:r>
@@ -2425,27 +2152,17 @@
             <w:r>
               <w:t>std::</w:t>
             </w:r>
-            <w:proofErr w:type="spellStart"/>
             <w:proofErr w:type="gramEnd"/>
             <w:r>
-              <w:t>ifstream</w:t>
-            </w:r>
-            <w:proofErr w:type="spellEnd"/>
-            <w:r>
-              <w:t xml:space="preserve"> and </w:t>
+              <w:t xml:space="preserve">ifstream and </w:t>
             </w:r>
             <w:proofErr w:type="gramStart"/>
             <w:r>
               <w:t>std::</w:t>
             </w:r>
-            <w:proofErr w:type="spellStart"/>
             <w:proofErr w:type="gramEnd"/>
             <w:r>
-              <w:t>ofstream</w:t>
-            </w:r>
-            <w:proofErr w:type="spellEnd"/>
-            <w:r>
-              <w:t xml:space="preserve"> to read/write state on disk.</w:t>
+              <w:t>ofstream to read/write state on disk.</w:t>
             </w:r>
           </w:p>
         </w:tc>
@@ -2462,27 +2179,17 @@
             <w:tcW w:w="2268" w:type="dxa"/>
           </w:tcPr>
           <w:p>
-            <w:proofErr w:type="spellStart"/>
             <w:proofErr w:type="gramStart"/>
             <w:r>
-              <w:t>displayAdminMenu</w:t>
-            </w:r>
-            <w:proofErr w:type="spellEnd"/>
-            <w:r>
-              <w:t>(</w:t>
+              <w:t>displayAdminMenu(</w:t>
             </w:r>
             <w:proofErr w:type="gramEnd"/>
             <w:r>
               <w:t xml:space="preserve">) / </w:t>
             </w:r>
-            <w:proofErr w:type="spellStart"/>
             <w:proofErr w:type="gramStart"/>
             <w:r>
-              <w:t>displayCustomerMenu</w:t>
-            </w:r>
-            <w:proofErr w:type="spellEnd"/>
-            <w:r>
-              <w:t>(</w:t>
+              <w:t>displayCustomerMenu(</w:t>
             </w:r>
             <w:proofErr w:type="gramEnd"/>
             <w:r>
@@ -2527,14 +2234,9 @@
             <w:tcW w:w="2268" w:type="dxa"/>
           </w:tcPr>
           <w:p>
-            <w:proofErr w:type="spellStart"/>
             <w:proofErr w:type="gramStart"/>
             <w:r>
-              <w:t>calculateDamageFee</w:t>
-            </w:r>
-            <w:proofErr w:type="spellEnd"/>
-            <w:r>
-              <w:t>(</w:t>
+              <w:t>calculateDamageFee(</w:t>
             </w:r>
             <w:proofErr w:type="gramEnd"/>
             <w:r>
@@ -2575,14 +2277,9 @@
             <w:tcW w:w="2268" w:type="dxa"/>
           </w:tcPr>
           <w:p>
-            <w:proofErr w:type="spellStart"/>
             <w:proofErr w:type="gramStart"/>
             <w:r>
-              <w:t>calculateRentalFee</w:t>
-            </w:r>
-            <w:proofErr w:type="spellEnd"/>
-            <w:r>
-              <w:t>(</w:t>
+              <w:t>calculateRentalFee(</w:t>
             </w:r>
             <w:proofErr w:type="gramEnd"/>
             <w:r>
@@ -2623,14 +2320,9 @@
             <w:tcW w:w="2268" w:type="dxa"/>
           </w:tcPr>
           <w:p>
-            <w:proofErr w:type="spellStart"/>
             <w:proofErr w:type="gramStart"/>
             <w:r>
-              <w:t>rentVehicle</w:t>
-            </w:r>
-            <w:proofErr w:type="spellEnd"/>
-            <w:r>
-              <w:t>(</w:t>
+              <w:t>rentVehicle(</w:t>
             </w:r>
             <w:proofErr w:type="gramEnd"/>
             <w:r>
@@ -2671,14 +2363,9 @@
             <w:tcW w:w="2268" w:type="dxa"/>
           </w:tcPr>
           <w:p>
-            <w:proofErr w:type="spellStart"/>
             <w:proofErr w:type="gramStart"/>
             <w:r>
-              <w:t>returnVehicle</w:t>
-            </w:r>
-            <w:proofErr w:type="spellEnd"/>
-            <w:r>
-              <w:t>(</w:t>
+              <w:t>returnVehicle(</w:t>
             </w:r>
             <w:proofErr w:type="gramEnd"/>
             <w:r>
@@ -2719,14 +2406,9 @@
             <w:tcW w:w="2268" w:type="dxa"/>
           </w:tcPr>
           <w:p>
-            <w:proofErr w:type="spellStart"/>
             <w:proofErr w:type="gramStart"/>
             <w:r>
-              <w:t>markUnderMaintenance</w:t>
-            </w:r>
-            <w:proofErr w:type="spellEnd"/>
-            <w:r>
-              <w:t>(</w:t>
+              <w:t>markUnderMaintenance(</w:t>
             </w:r>
             <w:proofErr w:type="gramEnd"/>
             <w:r>
@@ -2771,14 +2453,9 @@
             <w:tcW w:w="2268" w:type="dxa"/>
           </w:tcPr>
           <w:p>
-            <w:proofErr w:type="spellStart"/>
             <w:proofErr w:type="gramStart"/>
             <w:r>
-              <w:t>verifyIdentity</w:t>
-            </w:r>
-            <w:proofErr w:type="spellEnd"/>
-            <w:r>
-              <w:t>(</w:t>
+              <w:t>verifyIdentity(</w:t>
             </w:r>
             <w:proofErr w:type="gramEnd"/>
             <w:r>
@@ -2822,14 +2499,9 @@
             <w:tcW w:w="2268" w:type="dxa"/>
           </w:tcPr>
           <w:p>
-            <w:proofErr w:type="spellStart"/>
             <w:proofErr w:type="gramStart"/>
             <w:r>
-              <w:t>confirmSignOff</w:t>
-            </w:r>
-            <w:proofErr w:type="spellEnd"/>
-            <w:r>
-              <w:t>(</w:t>
+              <w:t>confirmSignOff(</w:t>
             </w:r>
             <w:proofErr w:type="gramEnd"/>
             <w:r>
@@ -2956,11 +2628,9 @@
             <w:tcW w:w="1696" w:type="dxa"/>
           </w:tcPr>
           <w:p>
-            <w:proofErr w:type="spellStart"/>
             <w:r>
               <w:t>DamageLog</w:t>
             </w:r>
-            <w:proofErr w:type="spellEnd"/>
           </w:p>
         </w:tc>
         <w:tc>
@@ -2968,14 +2638,9 @@
             <w:tcW w:w="2268" w:type="dxa"/>
           </w:tcPr>
           <w:p>
-            <w:proofErr w:type="spellStart"/>
             <w:proofErr w:type="gramStart"/>
             <w:r>
-              <w:t>addLog</w:t>
-            </w:r>
-            <w:proofErr w:type="spellEnd"/>
-            <w:r>
-              <w:t>(</w:t>
+              <w:t>addLog(</w:t>
             </w:r>
             <w:proofErr w:type="gramEnd"/>
             <w:r>
@@ -3024,14 +2689,9 @@
             <w:tcW w:w="2268" w:type="dxa"/>
           </w:tcPr>
           <w:p>
-            <w:proofErr w:type="spellStart"/>
             <w:proofErr w:type="gramStart"/>
             <w:r>
-              <w:t>generateDamageReport</w:t>
-            </w:r>
-            <w:proofErr w:type="spellEnd"/>
-            <w:r>
-              <w:t>(</w:t>
+              <w:t>generateDamageReport(</w:t>
             </w:r>
             <w:proofErr w:type="gramEnd"/>
             <w:r>
@@ -3075,23 +2735,13 @@
             <w:tcW w:w="2268" w:type="dxa"/>
           </w:tcPr>
           <w:p>
-            <w:proofErr w:type="spellStart"/>
             <w:proofErr w:type="gramStart"/>
             <w:r>
-              <w:t>confirmCustomerSignOff</w:t>
-            </w:r>
-            <w:proofErr w:type="spellEnd"/>
-            <w:r>
-              <w:t>(</w:t>
-            </w:r>
-            <w:proofErr w:type="spellStart"/>
+              <w:t>confirmCustomerSignOff(</w:t>
+            </w:r>
             <w:proofErr w:type="gramEnd"/>
             <w:r>
-              <w:t>customerID</w:t>
-            </w:r>
-            <w:proofErr w:type="spellEnd"/>
-            <w:r>
-              <w:t>: int)</w:t>
+              <w:t>customerID: int)</w:t>
             </w:r>
           </w:p>
         </w:tc>

</xml_diff>

<commit_message>
feat: Enhance vehicle management with maintenance functionality and database integration
</commit_message>
<xml_diff>
--- a/Project Proposal.docx
+++ b/Project Proposal.docx
@@ -884,7 +884,23 @@
         <w:jc w:val="both"/>
       </w:pPr>
       <w:r>
-        <w:t>Creating a base class Vehicle and derived class such as StandardCar, LuxuryCar, and SUV. Then, implementing a</w:t>
+        <w:t xml:space="preserve">Creating a base class Vehicle and derived class such as </w:t>
+      </w:r>
+      <w:proofErr w:type="spellStart"/>
+      <w:r>
+        <w:t>StandardCar</w:t>
+      </w:r>
+      <w:proofErr w:type="spellEnd"/>
+      <w:r>
+        <w:t xml:space="preserve">, </w:t>
+      </w:r>
+      <w:proofErr w:type="spellStart"/>
+      <w:r>
+        <w:t>LuxuryCar</w:t>
+      </w:r>
+      <w:proofErr w:type="spellEnd"/>
+      <w:r>
+        <w:t>, and SUV. Then, implementing a</w:t>
       </w:r>
       <w:r>
         <w:t>n</w:t>
@@ -900,7 +916,23 @@
         <w:t>abstract function</w:t>
       </w:r>
       <w:r>
-        <w:t xml:space="preserve"> calculateDamageFee (double severityScore) using </w:t>
+        <w:t xml:space="preserve"> </w:t>
+      </w:r>
+      <w:proofErr w:type="spellStart"/>
+      <w:r>
+        <w:t>calculateDamageFee</w:t>
+      </w:r>
+      <w:proofErr w:type="spellEnd"/>
+      <w:r>
+        <w:t xml:space="preserve"> (double </w:t>
+      </w:r>
+      <w:proofErr w:type="spellStart"/>
+      <w:r>
+        <w:t>severityScore</w:t>
+      </w:r>
+      <w:proofErr w:type="spellEnd"/>
+      <w:r>
+        <w:t xml:space="preserve">) using </w:t>
       </w:r>
       <w:r>
         <w:rPr>
@@ -910,7 +942,23 @@
         <w:t>polymorphism</w:t>
       </w:r>
       <w:r>
-        <w:t xml:space="preserve">. For instance, repairing a scratched LuxuryCar computes a higher rate or multiplier than a StandardCar. Storing inspection logs inside a </w:t>
+        <w:t xml:space="preserve">. For instance, repairing a scratched </w:t>
+      </w:r>
+      <w:proofErr w:type="spellStart"/>
+      <w:r>
+        <w:t>LuxuryCar</w:t>
+      </w:r>
+      <w:proofErr w:type="spellEnd"/>
+      <w:r>
+        <w:t xml:space="preserve"> computes a higher rate or multiplier than a </w:t>
+      </w:r>
+      <w:proofErr w:type="spellStart"/>
+      <w:r>
+        <w:t>StandardCar</w:t>
+      </w:r>
+      <w:proofErr w:type="spellEnd"/>
+      <w:r>
+        <w:t xml:space="preserve">. Storing inspection logs inside a </w:t>
       </w:r>
       <w:proofErr w:type="gramStart"/>
       <w:r>
@@ -918,7 +966,15 @@
       </w:r>
       <w:proofErr w:type="gramEnd"/>
       <w:r>
-        <w:t>vector&lt;string&gt; or a custom DamageLog object ensures its transparent record-keeping.</w:t>
+        <w:t xml:space="preserve">vector&lt;string&gt; or a custom </w:t>
+      </w:r>
+      <w:proofErr w:type="spellStart"/>
+      <w:r>
+        <w:t>DamageLog</w:t>
+      </w:r>
+      <w:proofErr w:type="spellEnd"/>
+      <w:r>
+        <w:t xml:space="preserve"> object ensures its transparent record-keeping.</w:t>
       </w:r>
       <w:r>
         <w:t xml:space="preserve"> Besides, system can automatically </w:t>
@@ -952,17 +1008,65 @@
         <w:jc w:val="both"/>
       </w:pPr>
       <w:r>
-        <w:t xml:space="preserve">Implement a centralized RentalSystem class that manages fleet availability in real time. Use STL containers like </w:t>
-      </w:r>
+        <w:t xml:space="preserve">Implement a centralized </w:t>
+      </w:r>
+      <w:proofErr w:type="spellStart"/>
+      <w:r>
+        <w:t>RentalSystem</w:t>
+      </w:r>
+      <w:proofErr w:type="spellEnd"/>
+      <w:r>
+        <w:t xml:space="preserve"> class that manages fleet availability in real time. Use STL containers like </w:t>
+      </w:r>
+      <w:proofErr w:type="gramStart"/>
       <w:r>
         <w:rPr>
           <w:b/>
           <w:bCs/>
         </w:rPr>
-        <w:t>std::unordered_map</w:t>
-      </w:r>
-      <w:r>
-        <w:t>&lt;string, Vehicle*&gt; for O(1) fast lookup by License Plate or Vehicle ID or std::vector combined with std::find_if algorithm.</w:t>
+        <w:t>std::</w:t>
+      </w:r>
+      <w:proofErr w:type="spellStart"/>
+      <w:proofErr w:type="gramEnd"/>
+      <w:r>
+        <w:rPr>
+          <w:b/>
+          <w:bCs/>
+        </w:rPr>
+        <w:t>unordered_map</w:t>
+      </w:r>
+      <w:proofErr w:type="spellEnd"/>
+      <w:r>
+        <w:t xml:space="preserve">&lt;string, Vehicle*&gt; for </w:t>
+      </w:r>
+      <w:proofErr w:type="gramStart"/>
+      <w:r>
+        <w:t>O(</w:t>
+      </w:r>
+      <w:proofErr w:type="gramEnd"/>
+      <w:r>
+        <w:t xml:space="preserve">1) fast lookup by License Plate or Vehicle ID or </w:t>
+      </w:r>
+      <w:proofErr w:type="gramStart"/>
+      <w:r>
+        <w:t>std::</w:t>
+      </w:r>
+      <w:proofErr w:type="gramEnd"/>
+      <w:r>
+        <w:t xml:space="preserve">vector combined with </w:t>
+      </w:r>
+      <w:proofErr w:type="gramStart"/>
+      <w:r>
+        <w:t>std::</w:t>
+      </w:r>
+      <w:proofErr w:type="spellStart"/>
+      <w:proofErr w:type="gramEnd"/>
+      <w:r>
+        <w:t>find_if</w:t>
+      </w:r>
+      <w:proofErr w:type="spellEnd"/>
+      <w:r>
+        <w:t xml:space="preserve"> algorithm.</w:t>
       </w:r>
       <w:r>
         <w:t xml:space="preserve"> Automated availability state changes (Available </w:t>
@@ -1048,7 +1152,28 @@
         <w:t>abstract</w:t>
       </w:r>
       <w:r>
-        <w:t xml:space="preserve"> method virtual double calculateRentalFee(int days) const = 0, inside a base class or interface. Derived classes override this to apply dynamic pricing strategies, such as LuxuryCar includes mandatory security deposits and premium insurance rates, then long-term rentals automatically trigger a percentage discount inside the calculation function.</w:t>
+        <w:t xml:space="preserve"> method virtual double </w:t>
+      </w:r>
+      <w:proofErr w:type="spellStart"/>
+      <w:proofErr w:type="gramStart"/>
+      <w:r>
+        <w:t>calculateRentalFee</w:t>
+      </w:r>
+      <w:proofErr w:type="spellEnd"/>
+      <w:r>
+        <w:t>(</w:t>
+      </w:r>
+      <w:proofErr w:type="gramEnd"/>
+      <w:r>
+        <w:t xml:space="preserve">int days) const = 0, inside a base class or interface. Derived classes override this to apply dynamic pricing strategies, such as </w:t>
+      </w:r>
+      <w:proofErr w:type="spellStart"/>
+      <w:r>
+        <w:t>LuxuryCar</w:t>
+      </w:r>
+      <w:proofErr w:type="spellEnd"/>
+      <w:r>
+        <w:t xml:space="preserve"> includes mandatory security deposits and premium insurance rates, then long-term rentals automatically trigger a percentage discount inside the calculation function.</w:t>
       </w:r>
       <w:r>
         <w:t xml:space="preserve"> Adjust the prices automatically based on seasonality is also can be consider, dynamic pricing can optimize revenue and ensure staying competitive in the market.</w:t>
@@ -1086,31 +1211,97 @@
         <w:t xml:space="preserve">, </w:t>
       </w:r>
       <w:r>
-        <w:t>such as status, mileage, and assignedCustomer</w:t>
-      </w:r>
+        <w:t xml:space="preserve">such as status, mileage, and </w:t>
+      </w:r>
+      <w:proofErr w:type="spellStart"/>
+      <w:r>
+        <w:t>assignedCustomer</w:t>
+      </w:r>
+      <w:proofErr w:type="spellEnd"/>
       <w:r>
         <w:t xml:space="preserve"> </w:t>
       </w:r>
       <w:r>
-        <w:t xml:space="preserve">as private or protected, exposing explicit state-transition member functions like rentVehicle(), returnVehicle(), and markUnderMaintenance(). The system implements File Persistence using </w:t>
-      </w:r>
+        <w:t xml:space="preserve">as private or protected, exposing explicit state-transition member functions like </w:t>
+      </w:r>
+      <w:proofErr w:type="spellStart"/>
+      <w:proofErr w:type="gramStart"/>
+      <w:r>
+        <w:t>rentVehicle</w:t>
+      </w:r>
+      <w:proofErr w:type="spellEnd"/>
+      <w:r>
+        <w:t>(</w:t>
+      </w:r>
+      <w:proofErr w:type="gramEnd"/>
+      <w:r>
+        <w:t xml:space="preserve">), </w:t>
+      </w:r>
+      <w:proofErr w:type="spellStart"/>
+      <w:proofErr w:type="gramStart"/>
+      <w:r>
+        <w:t>returnVehicle</w:t>
+      </w:r>
+      <w:proofErr w:type="spellEnd"/>
+      <w:r>
+        <w:t>(</w:t>
+      </w:r>
+      <w:proofErr w:type="gramEnd"/>
+      <w:r>
+        <w:t xml:space="preserve">), and </w:t>
+      </w:r>
+      <w:proofErr w:type="spellStart"/>
+      <w:proofErr w:type="gramStart"/>
+      <w:r>
+        <w:t>markUnderMaintenance</w:t>
+      </w:r>
+      <w:proofErr w:type="spellEnd"/>
+      <w:r>
+        <w:t>(</w:t>
+      </w:r>
+      <w:proofErr w:type="gramEnd"/>
+      <w:r>
+        <w:t xml:space="preserve">). The system implements File Persistence using </w:t>
+      </w:r>
+      <w:proofErr w:type="gramStart"/>
       <w:r>
         <w:rPr>
           <w:b/>
           <w:bCs/>
         </w:rPr>
-        <w:t>std::ifstream</w:t>
-      </w:r>
-      <w:r>
-        <w:t xml:space="preserve"> and </w:t>
-      </w:r>
+        <w:t>std::</w:t>
+      </w:r>
+      <w:proofErr w:type="spellStart"/>
+      <w:proofErr w:type="gramEnd"/>
       <w:r>
         <w:rPr>
           <w:b/>
           <w:bCs/>
         </w:rPr>
-        <w:t>std::ofstream</w:t>
-      </w:r>
+        <w:t>ifstream</w:t>
+      </w:r>
+      <w:proofErr w:type="spellEnd"/>
+      <w:r>
+        <w:t xml:space="preserve"> and </w:t>
+      </w:r>
+      <w:proofErr w:type="gramStart"/>
+      <w:r>
+        <w:rPr>
+          <w:b/>
+          <w:bCs/>
+        </w:rPr>
+        <w:t>std::</w:t>
+      </w:r>
+      <w:proofErr w:type="spellStart"/>
+      <w:proofErr w:type="gramEnd"/>
+      <w:r>
+        <w:rPr>
+          <w:b/>
+          <w:bCs/>
+        </w:rPr>
+        <w:t>ofstream</w:t>
+      </w:r>
+      <w:proofErr w:type="spellEnd"/>
       <w:r>
         <w:t xml:space="preserve"> to read and write vehicle states to external storage files (vehicles.txt), preserving complete maintenance logs and service histories across application restarts. Role-based menu options allow administrators to monitor real-time fleet status and maintenance alerts while limiting customer views to their active transactions.</w:t>
       </w:r>
@@ -1252,7 +1443,41 @@
         <w:t xml:space="preserve">Real-time vehicle availability management powered by STL containers </w:t>
       </w:r>
       <w:r>
-        <w:t>(std::unordered_map / std::vector with std::find_if) using License Plate or Vehicle ID.</w:t>
+        <w:t>(</w:t>
+      </w:r>
+      <w:proofErr w:type="gramStart"/>
+      <w:r>
+        <w:t>std::</w:t>
+      </w:r>
+      <w:proofErr w:type="spellStart"/>
+      <w:proofErr w:type="gramEnd"/>
+      <w:r>
+        <w:t>unordered_map</w:t>
+      </w:r>
+      <w:proofErr w:type="spellEnd"/>
+      <w:r>
+        <w:t xml:space="preserve"> / </w:t>
+      </w:r>
+      <w:proofErr w:type="gramStart"/>
+      <w:r>
+        <w:t>std::</w:t>
+      </w:r>
+      <w:proofErr w:type="gramEnd"/>
+      <w:r>
+        <w:t xml:space="preserve">vector with </w:t>
+      </w:r>
+      <w:proofErr w:type="gramStart"/>
+      <w:r>
+        <w:t>std::</w:t>
+      </w:r>
+      <w:proofErr w:type="spellStart"/>
+      <w:proofErr w:type="gramEnd"/>
+      <w:r>
+        <w:t>find_if</w:t>
+      </w:r>
+      <w:proofErr w:type="spellEnd"/>
+      <w:r>
+        <w:t>) using License Plate or Vehicle ID.</w:t>
       </w:r>
     </w:p>
     <w:p>
@@ -1618,14 +1843,27 @@
       <w:r>
         <w:t xml:space="preserve">Figure </w:t>
       </w:r>
-      <w:fldSimple w:instr=" SEQ Figure \* ARABIC ">
-        <w:r>
-          <w:rPr>
-            <w:noProof/>
-          </w:rPr>
-          <w:t>1</w:t>
-        </w:r>
-      </w:fldSimple>
+      <w:r>
+        <w:fldChar w:fldCharType="begin"/>
+      </w:r>
+      <w:r>
+        <w:instrText xml:space="preserve"> SEQ Figure \* ARABIC </w:instrText>
+      </w:r>
+      <w:r>
+        <w:fldChar w:fldCharType="separate"/>
+      </w:r>
+      <w:r>
+        <w:rPr>
+          <w:noProof/>
+        </w:rPr>
+        <w:t>1</w:t>
+      </w:r>
+      <w:r>
+        <w:rPr>
+          <w:noProof/>
+        </w:rPr>
+        <w:fldChar w:fldCharType="end"/>
+      </w:r>
       <w:r>
         <w:t xml:space="preserve"> UML Diagram</w:t>
       </w:r>
@@ -1685,14 +1923,27 @@
       <w:r>
         <w:t xml:space="preserve">Figure </w:t>
       </w:r>
-      <w:fldSimple w:instr=" SEQ Figure \* ARABIC ">
-        <w:r>
-          <w:rPr>
-            <w:noProof/>
-          </w:rPr>
-          <w:t>2</w:t>
-        </w:r>
-      </w:fldSimple>
+      <w:r>
+        <w:fldChar w:fldCharType="begin"/>
+      </w:r>
+      <w:r>
+        <w:instrText xml:space="preserve"> SEQ Figure \* ARABIC </w:instrText>
+      </w:r>
+      <w:r>
+        <w:fldChar w:fldCharType="separate"/>
+      </w:r>
+      <w:r>
+        <w:rPr>
+          <w:noProof/>
+        </w:rPr>
+        <w:t>2</w:t>
+      </w:r>
+      <w:r>
+        <w:rPr>
+          <w:noProof/>
+        </w:rPr>
+        <w:fldChar w:fldCharType="end"/>
+      </w:r>
       <w:r>
         <w:t xml:space="preserve"> ER Diagram</w:t>
       </w:r>
@@ -1707,6 +1958,9 @@
         <w:keepNext/>
       </w:pPr>
       <w:r>
+        <w:rPr>
+          <w:noProof/>
+        </w:rPr>
         <w:lastRenderedPageBreak/>
         <w:drawing>
           <wp:inline distT="0" distB="0" distL="0" distR="0" wp14:anchorId="53739B34" wp14:editId="7B7E0D39">
@@ -1753,14 +2007,27 @@
       <w:r>
         <w:t xml:space="preserve">Figure </w:t>
       </w:r>
-      <w:fldSimple w:instr=" SEQ Figure \* ARABIC ">
-        <w:r>
-          <w:rPr>
-            <w:noProof/>
-          </w:rPr>
-          <w:t>3</w:t>
-        </w:r>
-      </w:fldSimple>
+      <w:r>
+        <w:fldChar w:fldCharType="begin"/>
+      </w:r>
+      <w:r>
+        <w:instrText xml:space="preserve"> SEQ Figure \* ARABIC </w:instrText>
+      </w:r>
+      <w:r>
+        <w:fldChar w:fldCharType="separate"/>
+      </w:r>
+      <w:r>
+        <w:rPr>
+          <w:noProof/>
+        </w:rPr>
+        <w:t>3</w:t>
+      </w:r>
+      <w:r>
+        <w:rPr>
+          <w:noProof/>
+        </w:rPr>
+        <w:fldChar w:fldCharType="end"/>
+      </w:r>
       <w:r>
         <w:t xml:space="preserve"> Use Case Diagram</w:t>
       </w:r>
@@ -1780,14 +2047,27 @@
         <w:lastRenderedPageBreak/>
         <w:t xml:space="preserve">Table </w:t>
       </w:r>
-      <w:fldSimple w:instr=" SEQ Table \* ARABIC ">
-        <w:r>
-          <w:rPr>
-            <w:noProof/>
-          </w:rPr>
-          <w:t>1</w:t>
-        </w:r>
-      </w:fldSimple>
+      <w:r>
+        <w:fldChar w:fldCharType="begin"/>
+      </w:r>
+      <w:r>
+        <w:instrText xml:space="preserve"> SEQ Table \* ARABIC </w:instrText>
+      </w:r>
+      <w:r>
+        <w:fldChar w:fldCharType="separate"/>
+      </w:r>
+      <w:r>
+        <w:rPr>
+          <w:noProof/>
+        </w:rPr>
+        <w:t>1</w:t>
+      </w:r>
+      <w:r>
+        <w:rPr>
+          <w:noProof/>
+        </w:rPr>
+        <w:fldChar w:fldCharType="end"/>
+      </w:r>
       <w:r>
         <w:t xml:space="preserve"> Classes and Functions</w:t>
       </w:r>
@@ -1913,9 +2193,11 @@
             <w:tcW w:w="1696" w:type="dxa"/>
           </w:tcPr>
           <w:p>
+            <w:proofErr w:type="spellStart"/>
             <w:r>
               <w:t>RentalSystem</w:t>
             </w:r>
+            <w:proofErr w:type="spellEnd"/>
           </w:p>
         </w:tc>
         <w:tc>
@@ -1923,9 +2205,14 @@
             <w:tcW w:w="2268" w:type="dxa"/>
           </w:tcPr>
           <w:p>
+            <w:proofErr w:type="spellStart"/>
             <w:proofErr w:type="gramStart"/>
             <w:r>
-              <w:t>lookupVehicle(</w:t>
+              <w:t>lookupVehicle</w:t>
+            </w:r>
+            <w:proofErr w:type="spellEnd"/>
+            <w:r>
+              <w:t>(</w:t>
             </w:r>
             <w:proofErr w:type="gramEnd"/>
             <w:r>
@@ -1957,7 +2244,23 @@
           </w:tcPr>
           <w:p>
             <w:r>
-              <w:t>Searches vehicleMap or vehicleList by ID and returns a matching Vehicle* pointer or iterator</w:t>
+              <w:t xml:space="preserve">Searches </w:t>
+            </w:r>
+            <w:proofErr w:type="spellStart"/>
+            <w:r>
+              <w:t>vehicleMap</w:t>
+            </w:r>
+            <w:proofErr w:type="spellEnd"/>
+            <w:r>
+              <w:t xml:space="preserve"> or </w:t>
+            </w:r>
+            <w:proofErr w:type="spellStart"/>
+            <w:r>
+              <w:t>vehicleList</w:t>
+            </w:r>
+            <w:proofErr w:type="spellEnd"/>
+            <w:r>
+              <w:t xml:space="preserve"> by ID and returns a matching Vehicle* pointer or iterator</w:t>
             </w:r>
             <w:r>
               <w:t>.</w:t>
@@ -1977,9 +2280,14 @@
             <w:tcW w:w="2268" w:type="dxa"/>
           </w:tcPr>
           <w:p>
+            <w:proofErr w:type="spellStart"/>
             <w:proofErr w:type="gramStart"/>
             <w:r>
-              <w:t>validateBookingDates(</w:t>
+              <w:t>validateBookingDates</w:t>
+            </w:r>
+            <w:proofErr w:type="spellEnd"/>
+            <w:r>
+              <w:t>(</w:t>
             </w:r>
             <w:proofErr w:type="gramEnd"/>
             <w:r>
@@ -2023,9 +2331,14 @@
             <w:tcW w:w="2268" w:type="dxa"/>
           </w:tcPr>
           <w:p>
+            <w:proofErr w:type="spellStart"/>
             <w:proofErr w:type="gramStart"/>
             <w:r>
-              <w:t>processTransaction(</w:t>
+              <w:t>processTransaction</w:t>
+            </w:r>
+            <w:proofErr w:type="spellEnd"/>
+            <w:r>
+              <w:t>(</w:t>
             </w:r>
             <w:proofErr w:type="gramEnd"/>
             <w:r>
@@ -2069,9 +2382,14 @@
             <w:tcW w:w="2268" w:type="dxa"/>
           </w:tcPr>
           <w:p>
+            <w:proofErr w:type="spellStart"/>
             <w:proofErr w:type="gramStart"/>
             <w:r>
-              <w:t>generateDigitalReceipt(</w:t>
+              <w:t>generateDigitalReceipt</w:t>
+            </w:r>
+            <w:proofErr w:type="spellEnd"/>
+            <w:r>
+              <w:t>(</w:t>
             </w:r>
             <w:proofErr w:type="gramEnd"/>
             <w:r>
@@ -2112,17 +2430,27 @@
             <w:tcW w:w="2268" w:type="dxa"/>
           </w:tcPr>
           <w:p>
+            <w:proofErr w:type="spellStart"/>
             <w:proofErr w:type="gramStart"/>
             <w:r>
-              <w:t>saveToFile(</w:t>
+              <w:t>saveToFile</w:t>
+            </w:r>
+            <w:proofErr w:type="spellEnd"/>
+            <w:r>
+              <w:t>(</w:t>
             </w:r>
             <w:proofErr w:type="gramEnd"/>
             <w:r>
               <w:t xml:space="preserve">) / </w:t>
             </w:r>
+            <w:proofErr w:type="spellStart"/>
             <w:proofErr w:type="gramStart"/>
             <w:r>
-              <w:t>loadFromFile(</w:t>
+              <w:t>loadFromFile</w:t>
+            </w:r>
+            <w:proofErr w:type="spellEnd"/>
+            <w:r>
+              <w:t>(</w:t>
             </w:r>
             <w:proofErr w:type="gramEnd"/>
             <w:r>
@@ -2152,17 +2480,27 @@
             <w:r>
               <w:t>std::</w:t>
             </w:r>
+            <w:proofErr w:type="spellStart"/>
             <w:proofErr w:type="gramEnd"/>
             <w:r>
-              <w:t xml:space="preserve">ifstream and </w:t>
+              <w:t>ifstream</w:t>
+            </w:r>
+            <w:proofErr w:type="spellEnd"/>
+            <w:r>
+              <w:t xml:space="preserve"> and </w:t>
             </w:r>
             <w:proofErr w:type="gramStart"/>
             <w:r>
               <w:t>std::</w:t>
             </w:r>
+            <w:proofErr w:type="spellStart"/>
             <w:proofErr w:type="gramEnd"/>
             <w:r>
-              <w:t>ofstream to read/write state on disk.</w:t>
+              <w:t>ofstream</w:t>
+            </w:r>
+            <w:proofErr w:type="spellEnd"/>
+            <w:r>
+              <w:t xml:space="preserve"> to read/write state on disk.</w:t>
             </w:r>
           </w:p>
         </w:tc>
@@ -2179,17 +2517,27 @@
             <w:tcW w:w="2268" w:type="dxa"/>
           </w:tcPr>
           <w:p>
+            <w:proofErr w:type="spellStart"/>
             <w:proofErr w:type="gramStart"/>
             <w:r>
-              <w:t>displayAdminMenu(</w:t>
+              <w:t>displayAdminMenu</w:t>
+            </w:r>
+            <w:proofErr w:type="spellEnd"/>
+            <w:r>
+              <w:t>(</w:t>
             </w:r>
             <w:proofErr w:type="gramEnd"/>
             <w:r>
               <w:t xml:space="preserve">) / </w:t>
             </w:r>
+            <w:proofErr w:type="spellStart"/>
             <w:proofErr w:type="gramStart"/>
             <w:r>
-              <w:t>displayCustomerMenu(</w:t>
+              <w:t>displayCustomerMenu</w:t>
+            </w:r>
+            <w:proofErr w:type="spellEnd"/>
+            <w:r>
+              <w:t>(</w:t>
             </w:r>
             <w:proofErr w:type="gramEnd"/>
             <w:r>
@@ -2234,9 +2582,14 @@
             <w:tcW w:w="2268" w:type="dxa"/>
           </w:tcPr>
           <w:p>
+            <w:proofErr w:type="spellStart"/>
             <w:proofErr w:type="gramStart"/>
             <w:r>
-              <w:t>calculateDamageFee(</w:t>
+              <w:t>calculateDamageFee</w:t>
+            </w:r>
+            <w:proofErr w:type="spellEnd"/>
+            <w:r>
+              <w:t>(</w:t>
             </w:r>
             <w:proofErr w:type="gramEnd"/>
             <w:r>
@@ -2277,9 +2630,14 @@
             <w:tcW w:w="2268" w:type="dxa"/>
           </w:tcPr>
           <w:p>
+            <w:proofErr w:type="spellStart"/>
             <w:proofErr w:type="gramStart"/>
             <w:r>
-              <w:t>calculateRentalFee(</w:t>
+              <w:t>calculateRentalFee</w:t>
+            </w:r>
+            <w:proofErr w:type="spellEnd"/>
+            <w:r>
+              <w:t>(</w:t>
             </w:r>
             <w:proofErr w:type="gramEnd"/>
             <w:r>
@@ -2320,9 +2678,14 @@
             <w:tcW w:w="2268" w:type="dxa"/>
           </w:tcPr>
           <w:p>
+            <w:proofErr w:type="spellStart"/>
             <w:proofErr w:type="gramStart"/>
             <w:r>
-              <w:t>rentVehicle(</w:t>
+              <w:t>rentVehicle</w:t>
+            </w:r>
+            <w:proofErr w:type="spellEnd"/>
+            <w:r>
+              <w:t>(</w:t>
             </w:r>
             <w:proofErr w:type="gramEnd"/>
             <w:r>
@@ -2363,9 +2726,14 @@
             <w:tcW w:w="2268" w:type="dxa"/>
           </w:tcPr>
           <w:p>
+            <w:proofErr w:type="spellStart"/>
             <w:proofErr w:type="gramStart"/>
             <w:r>
-              <w:t>returnVehicle(</w:t>
+              <w:t>returnVehicle</w:t>
+            </w:r>
+            <w:proofErr w:type="spellEnd"/>
+            <w:r>
+              <w:t>(</w:t>
             </w:r>
             <w:proofErr w:type="gramEnd"/>
             <w:r>
@@ -2406,9 +2774,14 @@
             <w:tcW w:w="2268" w:type="dxa"/>
           </w:tcPr>
           <w:p>
+            <w:proofErr w:type="spellStart"/>
             <w:proofErr w:type="gramStart"/>
             <w:r>
-              <w:t>markUnderMaintenance(</w:t>
+              <w:t>markUnderMaintenance</w:t>
+            </w:r>
+            <w:proofErr w:type="spellEnd"/>
+            <w:r>
+              <w:t>(</w:t>
             </w:r>
             <w:proofErr w:type="gramEnd"/>
             <w:r>
@@ -2453,9 +2826,14 @@
             <w:tcW w:w="2268" w:type="dxa"/>
           </w:tcPr>
           <w:p>
+            <w:proofErr w:type="spellStart"/>
             <w:proofErr w:type="gramStart"/>
             <w:r>
-              <w:t>verifyIdentity(</w:t>
+              <w:t>verifyIdentity</w:t>
+            </w:r>
+            <w:proofErr w:type="spellEnd"/>
+            <w:r>
+              <w:t>(</w:t>
             </w:r>
             <w:proofErr w:type="gramEnd"/>
             <w:r>
@@ -2499,9 +2877,14 @@
             <w:tcW w:w="2268" w:type="dxa"/>
           </w:tcPr>
           <w:p>
+            <w:proofErr w:type="spellStart"/>
             <w:proofErr w:type="gramStart"/>
             <w:r>
-              <w:t>confirmSignOff(</w:t>
+              <w:t>confirmSignOff</w:t>
+            </w:r>
+            <w:proofErr w:type="spellEnd"/>
+            <w:r>
+              <w:t>(</w:t>
             </w:r>
             <w:proofErr w:type="gramEnd"/>
             <w:r>
@@ -2628,9 +3011,11 @@
             <w:tcW w:w="1696" w:type="dxa"/>
           </w:tcPr>
           <w:p>
+            <w:proofErr w:type="spellStart"/>
             <w:r>
               <w:t>DamageLog</w:t>
             </w:r>
+            <w:proofErr w:type="spellEnd"/>
           </w:p>
         </w:tc>
         <w:tc>
@@ -2638,9 +3023,14 @@
             <w:tcW w:w="2268" w:type="dxa"/>
           </w:tcPr>
           <w:p>
+            <w:proofErr w:type="spellStart"/>
             <w:proofErr w:type="gramStart"/>
             <w:r>
-              <w:t>addLog(</w:t>
+              <w:t>addLog</w:t>
+            </w:r>
+            <w:proofErr w:type="spellEnd"/>
+            <w:r>
+              <w:t>(</w:t>
             </w:r>
             <w:proofErr w:type="gramEnd"/>
             <w:r>
@@ -2689,9 +3079,14 @@
             <w:tcW w:w="2268" w:type="dxa"/>
           </w:tcPr>
           <w:p>
+            <w:proofErr w:type="spellStart"/>
             <w:proofErr w:type="gramStart"/>
             <w:r>
-              <w:t>generateDamageReport(</w:t>
+              <w:t>generateDamageReport</w:t>
+            </w:r>
+            <w:proofErr w:type="spellEnd"/>
+            <w:r>
+              <w:t>(</w:t>
             </w:r>
             <w:proofErr w:type="gramEnd"/>
             <w:r>
@@ -2735,13 +3130,23 @@
             <w:tcW w:w="2268" w:type="dxa"/>
           </w:tcPr>
           <w:p>
+            <w:proofErr w:type="spellStart"/>
             <w:proofErr w:type="gramStart"/>
             <w:r>
-              <w:t>confirmCustomerSignOff(</w:t>
-            </w:r>
+              <w:t>confirmCustomerSignOff</w:t>
+            </w:r>
+            <w:proofErr w:type="spellEnd"/>
+            <w:r>
+              <w:t>(</w:t>
+            </w:r>
+            <w:proofErr w:type="spellStart"/>
             <w:proofErr w:type="gramEnd"/>
             <w:r>
-              <w:t>customerID: int)</w:t>
+              <w:t>customerID</w:t>
+            </w:r>
+            <w:proofErr w:type="spellEnd"/>
+            <w:r>
+              <w:t>: int)</w:t>
             </w:r>
           </w:p>
         </w:tc>
@@ -2770,15 +3175,6 @@
         </w:tc>
       </w:tr>
     </w:tbl>
-    <w:p>
-      <w:pPr>
-        <w:pStyle w:val="Heading1"/>
-        <w:rPr>
-          <w:sz w:val="32"/>
-          <w:szCs w:val="32"/>
-        </w:rPr>
-      </w:pPr>
-    </w:p>
     <w:p>
       <w:pPr>
         <w:rPr>
@@ -2797,6 +3193,64 @@
       </w:r>
     </w:p>
     <w:p>
+      <w:bookmarkStart w:id="6" w:name="_Toc241673301"/>
+      <w:r>
+        <w:lastRenderedPageBreak/>
+        <w:drawing>
+          <wp:inline distT="0" distB="0" distL="0" distR="0" wp14:anchorId="497DA854" wp14:editId="74AF8A42">
+            <wp:extent cx="4895238" cy="3771429"/>
+            <wp:effectExtent l="0" t="0" r="635" b="635"/>
+            <wp:docPr id="168749231" name="Picture 1"/>
+            <wp:cNvGraphicFramePr>
+              <a:graphicFrameLocks xmlns:a="http://schemas.openxmlformats.org/drawingml/2006/main" noChangeAspect="1"/>
+            </wp:cNvGraphicFramePr>
+            <a:graphic xmlns:a="http://schemas.openxmlformats.org/drawingml/2006/main">
+              <a:graphicData uri="http://schemas.openxmlformats.org/drawingml/2006/picture">
+                <pic:pic xmlns:pic="http://schemas.openxmlformats.org/drawingml/2006/picture">
+                  <pic:nvPicPr>
+                    <pic:cNvPr id="168749231" name=""/>
+                    <pic:cNvPicPr/>
+                  </pic:nvPicPr>
+                  <pic:blipFill>
+                    <a:blip r:embed="rId13"/>
+                    <a:stretch>
+                      <a:fillRect/>
+                    </a:stretch>
+                  </pic:blipFill>
+                  <pic:spPr>
+                    <a:xfrm>
+                      <a:off x="0" y="0"/>
+                      <a:ext cx="4895238" cy="3771429"/>
+                    </a:xfrm>
+                    <a:prstGeom prst="rect">
+                      <a:avLst/>
+                    </a:prstGeom>
+                  </pic:spPr>
+                </pic:pic>
+              </a:graphicData>
+            </a:graphic>
+          </wp:inline>
+        </w:drawing>
+      </w:r>
+    </w:p>
+    <w:p>
+      <w:pPr>
+        <w:rPr>
+          <w:rFonts w:asciiTheme="majorHAnsi" w:eastAsiaTheme="majorEastAsia" w:hAnsiTheme="majorHAnsi" w:cstheme="majorBidi"/>
+          <w:color w:val="0F4761" w:themeColor="accent1" w:themeShade="BF"/>
+          <w:sz w:val="32"/>
+          <w:szCs w:val="32"/>
+        </w:rPr>
+      </w:pPr>
+      <w:r>
+        <w:rPr>
+          <w:sz w:val="32"/>
+          <w:szCs w:val="32"/>
+        </w:rPr>
+        <w:br w:type="page"/>
+      </w:r>
+    </w:p>
+    <w:p>
       <w:pPr>
         <w:pStyle w:val="Heading1"/>
         <w:rPr>
@@ -2804,7 +3258,6 @@
           <w:szCs w:val="32"/>
         </w:rPr>
       </w:pPr>
-      <w:bookmarkStart w:id="6" w:name="_Toc241673301"/>
       <w:r>
         <w:rPr>
           <w:sz w:val="32"/>
@@ -2816,7 +3269,7 @@
       <w:bookmarkEnd w:id="6"/>
     </w:p>
     <w:p>
-      <w:hyperlink r:id="rId13" w:history="1">
+      <w:hyperlink r:id="rId14" w:history="1">
         <w:r>
           <w:rPr>
             <w:rStyle w:val="Hyperlink"/>
@@ -2826,7 +3279,7 @@
       </w:hyperlink>
     </w:p>
     <w:p>
-      <w:hyperlink r:id="rId14" w:history="1">
+      <w:hyperlink r:id="rId15" w:history="1">
         <w:r>
           <w:rPr>
             <w:rStyle w:val="Hyperlink"/>
@@ -2836,7 +3289,7 @@
       </w:hyperlink>
     </w:p>
     <w:p>
-      <w:hyperlink r:id="rId15" w:history="1">
+      <w:hyperlink r:id="rId16" w:history="1">
         <w:r>
           <w:rPr>
             <w:rStyle w:val="Hyperlink"/>
@@ -2847,7 +3300,7 @@
     </w:p>
     <w:p/>
     <w:sectPr>
-      <w:footerReference w:type="default" r:id="rId16"/>
+      <w:footerReference w:type="default" r:id="rId17"/>
       <w:pgSz w:w="12240" w:h="15840"/>
       <w:pgMar w:top="1440" w:right="1440" w:bottom="1440" w:left="1440" w:header="720" w:footer="720" w:gutter="0"/>
       <w:pgNumType w:start="1"/>

</xml_diff>

<commit_message>
feat: Implement damage fee calculation and inspection process for vehicle returns
</commit_message>
<xml_diff>
--- a/Project Proposal.docx
+++ b/Project Proposal.docx
@@ -1402,7 +1402,13 @@
         <w:jc w:val="both"/>
       </w:pPr>
       <w:r>
-        <w:t>Polymorphic Damage Fee: Calculates damage fees based on damage severity and vehicle type.</w:t>
+        <w:t xml:space="preserve">Polymorphic Damage Fee: Calculates damage fees based on damage </w:t>
+      </w:r>
+      <w:r>
+        <w:t>component</w:t>
+      </w:r>
+      <w:r>
+        <w:t xml:space="preserve"> and vehicle type.</w:t>
       </w:r>
     </w:p>
     <w:p>

</xml_diff>